<commit_message>
add source code dan foto output
</commit_message>
<xml_diff>
--- a/W6_P_1A_023.docx
+++ b/W6_P_1A_023.docx
@@ -169,48 +169,20 @@
           <w:sz w:val="28"/>
           <w:szCs w:val="28"/>
         </w:rPr>
-        <w:t>Repo GitHub: &lt;</w:t>
-      </w:r>
-      <w:proofErr w:type="spellStart"/>
-      <w:r>
-        <w:rPr>
-          <w:b/>
-          <w:bCs/>
-          <w:sz w:val="28"/>
-          <w:szCs w:val="28"/>
-        </w:rPr>
-        <w:t>Tuliskan</w:t>
-      </w:r>
-      <w:proofErr w:type="spellEnd"/>
-      <w:r>
-        <w:rPr>
-          <w:b/>
-          <w:bCs/>
-          <w:sz w:val="28"/>
-          <w:szCs w:val="28"/>
-        </w:rPr>
-        <w:t xml:space="preserve"> </w:t>
-      </w:r>
-      <w:proofErr w:type="spellStart"/>
-      <w:r>
-        <w:rPr>
-          <w:b/>
-          <w:bCs/>
-          <w:sz w:val="28"/>
-          <w:szCs w:val="28"/>
-        </w:rPr>
-        <w:t>Tautan</w:t>
-      </w:r>
-      <w:proofErr w:type="spellEnd"/>
-      <w:r>
-        <w:rPr>
-          <w:b/>
-          <w:bCs/>
-          <w:sz w:val="28"/>
-          <w:szCs w:val="28"/>
-        </w:rPr>
-        <w:t xml:space="preserve"> Repo GitHub&gt;</w:t>
-      </w:r>
+        <w:t xml:space="preserve">Repo GitHub: </w:t>
+      </w:r>
+      <w:hyperlink r:id="rId6" w:history="1">
+        <w:r>
+          <w:rPr>
+            <w:rStyle w:val="Hyperlink"/>
+            <w:b/>
+            <w:bCs/>
+            <w:sz w:val="28"/>
+            <w:szCs w:val="28"/>
+          </w:rPr>
+          <w:t>https://github.com/Dwdun/JobSheet---Week-6-Java-Stream-API</w:t>
+        </w:r>
+      </w:hyperlink>
     </w:p>
     <w:p>
       <w:pPr>
@@ -1559,12 +1531,12 @@
                 <w:b/>
                 <w:bCs/>
               </w:rPr>
+              <w:lastRenderedPageBreak/>
               <w:t>Source Code</w:t>
             </w:r>
           </w:p>
           <w:p>
             <w:r>
-              <w:lastRenderedPageBreak/>
               <w:t xml:space="preserve">package </w:t>
             </w:r>
             <w:proofErr w:type="spellStart"/>
@@ -2279,8 +2251,1060 @@
           </w:tcPr>
           <w:p>
             <w:pPr>
-              <w:jc w:val="both"/>
-            </w:pPr>
+              <w:pStyle w:val="ListParagraph"/>
+              <w:numPr>
+                <w:ilvl w:val="3"/>
+                <w:numId w:val="1"/>
+              </w:numPr>
+              <w:ind w:left="459"/>
+              <w:jc w:val="both"/>
+              <w:rPr>
+                <w:b/>
+                <w:bCs/>
+              </w:rPr>
+            </w:pPr>
+            <w:r>
+              <w:rPr>
+                <w:b/>
+                <w:bCs/>
+              </w:rPr>
+              <w:t>ProblemOne.java</w:t>
+            </w:r>
+          </w:p>
+          <w:p>
+            <w:pPr>
+              <w:pStyle w:val="ListParagraph"/>
+              <w:ind w:left="459"/>
+              <w:jc w:val="both"/>
+            </w:pPr>
+            <w:r>
+              <w:t xml:space="preserve">package </w:t>
+            </w:r>
+            <w:proofErr w:type="spellStart"/>
+            <w:proofErr w:type="gramStart"/>
+            <w:r>
+              <w:t>JavaProblems</w:t>
+            </w:r>
+            <w:proofErr w:type="spellEnd"/>
+            <w:r>
+              <w:t>;</w:t>
+            </w:r>
+            <w:proofErr w:type="gramEnd"/>
+          </w:p>
+          <w:p>
+            <w:pPr>
+              <w:pStyle w:val="ListParagraph"/>
+              <w:ind w:left="459"/>
+              <w:jc w:val="both"/>
+            </w:pPr>
+          </w:p>
+          <w:p>
+            <w:pPr>
+              <w:pStyle w:val="ListParagraph"/>
+              <w:ind w:left="459"/>
+              <w:jc w:val="both"/>
+            </w:pPr>
+            <w:r>
+              <w:t xml:space="preserve">import </w:t>
+            </w:r>
+            <w:proofErr w:type="spellStart"/>
+            <w:proofErr w:type="gramStart"/>
+            <w:r>
+              <w:t>java.util</w:t>
+            </w:r>
+            <w:proofErr w:type="gramEnd"/>
+            <w:r>
+              <w:t>.</w:t>
+            </w:r>
+            <w:proofErr w:type="gramStart"/>
+            <w:r>
+              <w:t>ArrayList</w:t>
+            </w:r>
+            <w:proofErr w:type="spellEnd"/>
+            <w:r>
+              <w:t>;</w:t>
+            </w:r>
+            <w:proofErr w:type="gramEnd"/>
+          </w:p>
+          <w:p>
+            <w:pPr>
+              <w:pStyle w:val="ListParagraph"/>
+              <w:ind w:left="459"/>
+              <w:jc w:val="both"/>
+            </w:pPr>
+            <w:r>
+              <w:t xml:space="preserve">import </w:t>
+            </w:r>
+            <w:proofErr w:type="spellStart"/>
+            <w:proofErr w:type="gramStart"/>
+            <w:r>
+              <w:t>java.util</w:t>
+            </w:r>
+            <w:proofErr w:type="gramEnd"/>
+            <w:r>
+              <w:t>.</w:t>
+            </w:r>
+            <w:proofErr w:type="gramStart"/>
+            <w:r>
+              <w:t>List</w:t>
+            </w:r>
+            <w:proofErr w:type="spellEnd"/>
+            <w:r>
+              <w:t>;</w:t>
+            </w:r>
+            <w:proofErr w:type="gramEnd"/>
+          </w:p>
+          <w:p>
+            <w:pPr>
+              <w:pStyle w:val="ListParagraph"/>
+              <w:ind w:left="459"/>
+              <w:jc w:val="both"/>
+            </w:pPr>
+            <w:r>
+              <w:t xml:space="preserve">import </w:t>
+            </w:r>
+            <w:proofErr w:type="spellStart"/>
+            <w:proofErr w:type="gramStart"/>
+            <w:r>
+              <w:t>java.util</w:t>
+            </w:r>
+            <w:proofErr w:type="gramEnd"/>
+            <w:r>
+              <w:t>.</w:t>
+            </w:r>
+            <w:proofErr w:type="gramStart"/>
+            <w:r>
+              <w:t>stream.Collectors</w:t>
+            </w:r>
+            <w:proofErr w:type="spellEnd"/>
+            <w:proofErr w:type="gramEnd"/>
+            <w:r>
+              <w:t>;</w:t>
+            </w:r>
+          </w:p>
+          <w:p>
+            <w:pPr>
+              <w:pStyle w:val="ListParagraph"/>
+              <w:ind w:left="459"/>
+              <w:jc w:val="both"/>
+            </w:pPr>
+          </w:p>
+          <w:p>
+            <w:pPr>
+              <w:pStyle w:val="ListParagraph"/>
+              <w:ind w:left="459"/>
+              <w:jc w:val="both"/>
+            </w:pPr>
+            <w:r>
+              <w:t xml:space="preserve">public class </w:t>
+            </w:r>
+            <w:proofErr w:type="spellStart"/>
+            <w:r>
+              <w:t>ProblemOne</w:t>
+            </w:r>
+            <w:proofErr w:type="spellEnd"/>
+            <w:r>
+              <w:t xml:space="preserve"> {</w:t>
+            </w:r>
+          </w:p>
+          <w:p>
+            <w:pPr>
+              <w:pStyle w:val="ListParagraph"/>
+              <w:ind w:left="459"/>
+              <w:jc w:val="both"/>
+            </w:pPr>
+            <w:r>
+              <w:t xml:space="preserve">    public static void </w:t>
+            </w:r>
+            <w:proofErr w:type="gramStart"/>
+            <w:r>
+              <w:t>main(String[</w:t>
+            </w:r>
+            <w:proofErr w:type="gramEnd"/>
+            <w:r>
+              <w:t xml:space="preserve">] </w:t>
+            </w:r>
+            <w:proofErr w:type="spellStart"/>
+            <w:r>
+              <w:t>args</w:t>
+            </w:r>
+            <w:proofErr w:type="spellEnd"/>
+            <w:r>
+              <w:t>) {</w:t>
+            </w:r>
+          </w:p>
+          <w:p>
+            <w:pPr>
+              <w:pStyle w:val="ListParagraph"/>
+              <w:ind w:left="459"/>
+              <w:jc w:val="both"/>
+            </w:pPr>
+            <w:r>
+              <w:lastRenderedPageBreak/>
+              <w:t xml:space="preserve">        </w:t>
+            </w:r>
+            <w:proofErr w:type="spellStart"/>
+            <w:r>
+              <w:t>ArrayList</w:t>
+            </w:r>
+            <w:proofErr w:type="spellEnd"/>
+            <w:r>
+              <w:t xml:space="preserve">&lt;Employee&gt; list = new </w:t>
+            </w:r>
+            <w:proofErr w:type="spellStart"/>
+            <w:r>
+              <w:t>ArrayList</w:t>
+            </w:r>
+            <w:proofErr w:type="spellEnd"/>
+            <w:r>
+              <w:t>&lt;</w:t>
+            </w:r>
+            <w:proofErr w:type="gramStart"/>
+            <w:r>
+              <w:t>&gt;();</w:t>
+            </w:r>
+            <w:proofErr w:type="gramEnd"/>
+          </w:p>
+          <w:p>
+            <w:pPr>
+              <w:pStyle w:val="ListParagraph"/>
+              <w:ind w:left="459"/>
+              <w:jc w:val="both"/>
+            </w:pPr>
+          </w:p>
+          <w:p>
+            <w:pPr>
+              <w:pStyle w:val="ListParagraph"/>
+              <w:ind w:left="459"/>
+              <w:jc w:val="both"/>
+            </w:pPr>
+            <w:r>
+              <w:t xml:space="preserve">        </w:t>
+            </w:r>
+            <w:proofErr w:type="spellStart"/>
+            <w:proofErr w:type="gramStart"/>
+            <w:r>
+              <w:t>list.add</w:t>
+            </w:r>
+            <w:proofErr w:type="spellEnd"/>
+            <w:r>
+              <w:t>(</w:t>
+            </w:r>
+            <w:proofErr w:type="gramEnd"/>
+            <w:r>
+              <w:t xml:space="preserve">new </w:t>
+            </w:r>
+            <w:proofErr w:type="gramStart"/>
+            <w:r>
+              <w:t>Employee(</w:t>
+            </w:r>
+            <w:proofErr w:type="gramEnd"/>
+            <w:r>
+              <w:t>"John", 50000)</w:t>
+            </w:r>
+            <w:proofErr w:type="gramStart"/>
+            <w:r>
+              <w:t>);</w:t>
+            </w:r>
+            <w:proofErr w:type="gramEnd"/>
+          </w:p>
+          <w:p>
+            <w:pPr>
+              <w:pStyle w:val="ListParagraph"/>
+              <w:ind w:left="459"/>
+              <w:jc w:val="both"/>
+            </w:pPr>
+            <w:r>
+              <w:t xml:space="preserve">        </w:t>
+            </w:r>
+            <w:proofErr w:type="spellStart"/>
+            <w:proofErr w:type="gramStart"/>
+            <w:r>
+              <w:t>list.add</w:t>
+            </w:r>
+            <w:proofErr w:type="spellEnd"/>
+            <w:r>
+              <w:t>(</w:t>
+            </w:r>
+            <w:proofErr w:type="gramEnd"/>
+            <w:r>
+              <w:t xml:space="preserve">new </w:t>
+            </w:r>
+            <w:proofErr w:type="gramStart"/>
+            <w:r>
+              <w:t>Employee(</w:t>
+            </w:r>
+            <w:proofErr w:type="gramEnd"/>
+            <w:r>
+              <w:t>"Rob", 70000)</w:t>
+            </w:r>
+            <w:proofErr w:type="gramStart"/>
+            <w:r>
+              <w:t>);</w:t>
+            </w:r>
+            <w:proofErr w:type="gramEnd"/>
+          </w:p>
+          <w:p>
+            <w:pPr>
+              <w:pStyle w:val="ListParagraph"/>
+              <w:ind w:left="459"/>
+              <w:jc w:val="both"/>
+            </w:pPr>
+            <w:r>
+              <w:t xml:space="preserve">        </w:t>
+            </w:r>
+            <w:proofErr w:type="spellStart"/>
+            <w:proofErr w:type="gramStart"/>
+            <w:r>
+              <w:t>list.add</w:t>
+            </w:r>
+            <w:proofErr w:type="spellEnd"/>
+            <w:r>
+              <w:t>(</w:t>
+            </w:r>
+            <w:proofErr w:type="gramEnd"/>
+            <w:r>
+              <w:t xml:space="preserve">new </w:t>
+            </w:r>
+            <w:proofErr w:type="gramStart"/>
+            <w:r>
+              <w:t>Employee(</w:t>
+            </w:r>
+            <w:proofErr w:type="gramEnd"/>
+            <w:r>
+              <w:t>"Bob", 40000)</w:t>
+            </w:r>
+            <w:proofErr w:type="gramStart"/>
+            <w:r>
+              <w:t>);</w:t>
+            </w:r>
+            <w:proofErr w:type="gramEnd"/>
+          </w:p>
+          <w:p>
+            <w:pPr>
+              <w:pStyle w:val="ListParagraph"/>
+              <w:ind w:left="459"/>
+              <w:jc w:val="both"/>
+            </w:pPr>
+            <w:r>
+              <w:t xml:space="preserve">        </w:t>
+            </w:r>
+            <w:proofErr w:type="spellStart"/>
+            <w:proofErr w:type="gramStart"/>
+            <w:r>
+              <w:t>list.add</w:t>
+            </w:r>
+            <w:proofErr w:type="spellEnd"/>
+            <w:r>
+              <w:t>(</w:t>
+            </w:r>
+            <w:proofErr w:type="gramEnd"/>
+            <w:r>
+              <w:t xml:space="preserve">new </w:t>
+            </w:r>
+            <w:proofErr w:type="gramStart"/>
+            <w:r>
+              <w:t>Employee(</w:t>
+            </w:r>
+            <w:proofErr w:type="gramEnd"/>
+            <w:r>
+              <w:t>"Alice", 10000)</w:t>
+            </w:r>
+            <w:proofErr w:type="gramStart"/>
+            <w:r>
+              <w:t>);</w:t>
+            </w:r>
+            <w:proofErr w:type="gramEnd"/>
+          </w:p>
+          <w:p>
+            <w:pPr>
+              <w:pStyle w:val="ListParagraph"/>
+              <w:ind w:left="459"/>
+              <w:jc w:val="both"/>
+            </w:pPr>
+          </w:p>
+          <w:p>
+            <w:pPr>
+              <w:pStyle w:val="ListParagraph"/>
+              <w:ind w:left="459"/>
+              <w:jc w:val="both"/>
+            </w:pPr>
+            <w:r>
+              <w:t xml:space="preserve">        // </w:t>
+            </w:r>
+            <w:proofErr w:type="spellStart"/>
+            <w:r>
+              <w:t>Melakukan</w:t>
+            </w:r>
+            <w:proofErr w:type="spellEnd"/>
+            <w:r>
+              <w:t xml:space="preserve"> proses filtering/sorting </w:t>
+            </w:r>
+            <w:proofErr w:type="spellStart"/>
+            <w:r>
+              <w:t>menggunakan</w:t>
+            </w:r>
+            <w:proofErr w:type="spellEnd"/>
+            <w:r>
+              <w:t xml:space="preserve"> Stream API</w:t>
+            </w:r>
+          </w:p>
+          <w:p>
+            <w:pPr>
+              <w:pStyle w:val="ListParagraph"/>
+              <w:ind w:left="459"/>
+              <w:jc w:val="both"/>
+            </w:pPr>
+            <w:r>
+              <w:t xml:space="preserve">        List&lt;Employee&gt; </w:t>
+            </w:r>
+            <w:proofErr w:type="spellStart"/>
+            <w:r>
+              <w:t>sortedEmp</w:t>
+            </w:r>
+            <w:proofErr w:type="spellEnd"/>
+            <w:r>
+              <w:t xml:space="preserve"> = </w:t>
+            </w:r>
+            <w:proofErr w:type="spellStart"/>
+            <w:proofErr w:type="gramStart"/>
+            <w:r>
+              <w:t>list.stream</w:t>
+            </w:r>
+            <w:proofErr w:type="spellEnd"/>
+            <w:proofErr w:type="gramEnd"/>
+            <w:r>
+              <w:t xml:space="preserve">() // Ubah list </w:t>
+            </w:r>
+            <w:proofErr w:type="spellStart"/>
+            <w:r>
+              <w:t>ke</w:t>
+            </w:r>
+            <w:proofErr w:type="spellEnd"/>
+            <w:r>
+              <w:t xml:space="preserve"> stream</w:t>
+            </w:r>
+          </w:p>
+          <w:p>
+            <w:pPr>
+              <w:pStyle w:val="ListParagraph"/>
+              <w:ind w:left="459"/>
+              <w:jc w:val="both"/>
+            </w:pPr>
+            <w:r>
+              <w:t xml:space="preserve">                // </w:t>
+            </w:r>
+            <w:proofErr w:type="spellStart"/>
+            <w:r>
+              <w:t>Mengurutkan</w:t>
+            </w:r>
+            <w:proofErr w:type="spellEnd"/>
+            <w:r>
+              <w:t xml:space="preserve"> employee </w:t>
+            </w:r>
+            <w:proofErr w:type="spellStart"/>
+            <w:r>
+              <w:t>berdasarkan</w:t>
+            </w:r>
+            <w:proofErr w:type="spellEnd"/>
+            <w:r>
+              <w:t xml:space="preserve"> nama</w:t>
+            </w:r>
+          </w:p>
+          <w:p>
+            <w:pPr>
+              <w:pStyle w:val="ListParagraph"/>
+              <w:ind w:left="459"/>
+              <w:jc w:val="both"/>
+            </w:pPr>
+            <w:r>
+              <w:t xml:space="preserve">                </w:t>
+            </w:r>
+            <w:proofErr w:type="gramStart"/>
+            <w:r>
+              <w:t>.sorted</w:t>
+            </w:r>
+            <w:proofErr w:type="gramEnd"/>
+            <w:r>
+              <w:t>((e1, e2) -&gt; e</w:t>
+            </w:r>
+            <w:proofErr w:type="gramStart"/>
+            <w:r>
+              <w:t>1.getName</w:t>
+            </w:r>
+            <w:proofErr w:type="gramEnd"/>
+            <w:r>
+              <w:t>(</w:t>
+            </w:r>
+            <w:proofErr w:type="gramStart"/>
+            <w:r>
+              <w:t>).</w:t>
+            </w:r>
+            <w:proofErr w:type="spellStart"/>
+            <w:r>
+              <w:t>compareTo</w:t>
+            </w:r>
+            <w:proofErr w:type="spellEnd"/>
+            <w:proofErr w:type="gramEnd"/>
+            <w:r>
+              <w:t>(e</w:t>
+            </w:r>
+            <w:proofErr w:type="gramStart"/>
+            <w:r>
+              <w:t>2.getName</w:t>
+            </w:r>
+            <w:proofErr w:type="gramEnd"/>
+            <w:r>
+              <w:t>()))</w:t>
+            </w:r>
+          </w:p>
+          <w:p>
+            <w:pPr>
+              <w:pStyle w:val="ListParagraph"/>
+              <w:ind w:left="459"/>
+              <w:jc w:val="both"/>
+            </w:pPr>
+            <w:r>
+              <w:t xml:space="preserve">                // </w:t>
+            </w:r>
+            <w:proofErr w:type="spellStart"/>
+            <w:r>
+              <w:t>Mengumpulkan</w:t>
+            </w:r>
+            <w:proofErr w:type="spellEnd"/>
+            <w:r>
+              <w:t xml:space="preserve"> </w:t>
+            </w:r>
+            <w:proofErr w:type="spellStart"/>
+            <w:r>
+              <w:t>hasil</w:t>
+            </w:r>
+            <w:proofErr w:type="spellEnd"/>
+            <w:r>
+              <w:t xml:space="preserve"> </w:t>
+            </w:r>
+            <w:proofErr w:type="spellStart"/>
+            <w:r>
+              <w:t>akhir</w:t>
+            </w:r>
+            <w:proofErr w:type="spellEnd"/>
+          </w:p>
+          <w:p>
+            <w:pPr>
+              <w:pStyle w:val="ListParagraph"/>
+              <w:ind w:left="459"/>
+              <w:jc w:val="both"/>
+            </w:pPr>
+            <w:r>
+              <w:t xml:space="preserve">                </w:t>
+            </w:r>
+            <w:proofErr w:type="gramStart"/>
+            <w:r>
+              <w:t>.collect</w:t>
+            </w:r>
+            <w:proofErr w:type="gramEnd"/>
+            <w:r>
+              <w:t>(</w:t>
+            </w:r>
+            <w:proofErr w:type="spellStart"/>
+            <w:r>
+              <w:t>Collectors.toList</w:t>
+            </w:r>
+            <w:proofErr w:type="spellEnd"/>
+            <w:r>
+              <w:t>()</w:t>
+            </w:r>
+            <w:proofErr w:type="gramStart"/>
+            <w:r>
+              <w:t>);</w:t>
+            </w:r>
+            <w:proofErr w:type="gramEnd"/>
+          </w:p>
+          <w:p>
+            <w:pPr>
+              <w:pStyle w:val="ListParagraph"/>
+              <w:ind w:left="459"/>
+              <w:jc w:val="both"/>
+            </w:pPr>
+          </w:p>
+          <w:p>
+            <w:pPr>
+              <w:pStyle w:val="ListParagraph"/>
+              <w:ind w:left="459"/>
+              <w:jc w:val="both"/>
+            </w:pPr>
+            <w:r>
+              <w:t xml:space="preserve">        </w:t>
+            </w:r>
+            <w:proofErr w:type="gramStart"/>
+            <w:r>
+              <w:t>for(</w:t>
+            </w:r>
+            <w:proofErr w:type="gramEnd"/>
+            <w:r>
+              <w:t xml:space="preserve">Employee </w:t>
+            </w:r>
+            <w:proofErr w:type="gramStart"/>
+            <w:r>
+              <w:t>e :</w:t>
+            </w:r>
+            <w:proofErr w:type="gramEnd"/>
+            <w:r>
+              <w:t xml:space="preserve"> </w:t>
+            </w:r>
+            <w:proofErr w:type="spellStart"/>
+            <w:proofErr w:type="gramStart"/>
+            <w:r>
+              <w:t>sortedEmp</w:t>
+            </w:r>
+            <w:proofErr w:type="spellEnd"/>
+            <w:r>
+              <w:t>){</w:t>
+            </w:r>
+            <w:proofErr w:type="gramEnd"/>
+          </w:p>
+          <w:p>
+            <w:pPr>
+              <w:pStyle w:val="ListParagraph"/>
+              <w:ind w:left="459"/>
+              <w:jc w:val="both"/>
+            </w:pPr>
+            <w:r>
+              <w:t xml:space="preserve">            </w:t>
+            </w:r>
+            <w:proofErr w:type="spellStart"/>
+            <w:r>
+              <w:t>System.out.println</w:t>
+            </w:r>
+            <w:proofErr w:type="spellEnd"/>
+            <w:r>
+              <w:t>(e</w:t>
+            </w:r>
+            <w:proofErr w:type="gramStart"/>
+            <w:r>
+              <w:t>);</w:t>
+            </w:r>
+            <w:proofErr w:type="gramEnd"/>
+          </w:p>
+          <w:p>
+            <w:pPr>
+              <w:pStyle w:val="ListParagraph"/>
+              <w:ind w:left="459"/>
+              <w:jc w:val="both"/>
+            </w:pPr>
+            <w:r>
+              <w:t xml:space="preserve">        }</w:t>
+            </w:r>
+          </w:p>
+          <w:p>
+            <w:pPr>
+              <w:pStyle w:val="ListParagraph"/>
+              <w:ind w:left="459"/>
+              <w:jc w:val="both"/>
+            </w:pPr>
+            <w:r>
+              <w:t xml:space="preserve">    }</w:t>
+            </w:r>
+          </w:p>
+          <w:p>
+            <w:pPr>
+              <w:pStyle w:val="ListParagraph"/>
+              <w:ind w:left="459"/>
+              <w:jc w:val="both"/>
+            </w:pPr>
+            <w:r>
+              <w:t>}</w:t>
+            </w:r>
+          </w:p>
+          <w:p>
+            <w:pPr>
+              <w:jc w:val="both"/>
+            </w:pPr>
+          </w:p>
+          <w:p>
+            <w:pPr>
+              <w:pStyle w:val="ListParagraph"/>
+              <w:numPr>
+                <w:ilvl w:val="3"/>
+                <w:numId w:val="1"/>
+              </w:numPr>
+              <w:ind w:left="459"/>
+              <w:jc w:val="both"/>
+              <w:rPr>
+                <w:b/>
+                <w:bCs/>
+              </w:rPr>
+            </w:pPr>
+            <w:r>
+              <w:rPr>
+                <w:b/>
+                <w:bCs/>
+              </w:rPr>
+              <w:t>Employee.java</w:t>
+            </w:r>
+          </w:p>
+          <w:p>
+            <w:pPr>
+              <w:pStyle w:val="ListParagraph"/>
+              <w:ind w:left="459"/>
+              <w:jc w:val="both"/>
+            </w:pPr>
+            <w:r>
+              <w:t xml:space="preserve">package </w:t>
+            </w:r>
+            <w:proofErr w:type="spellStart"/>
+            <w:proofErr w:type="gramStart"/>
+            <w:r>
+              <w:t>JavaProblems</w:t>
+            </w:r>
+            <w:proofErr w:type="spellEnd"/>
+            <w:r>
+              <w:t>;</w:t>
+            </w:r>
+            <w:proofErr w:type="gramEnd"/>
+          </w:p>
+          <w:p>
+            <w:pPr>
+              <w:pStyle w:val="ListParagraph"/>
+              <w:ind w:left="459"/>
+              <w:jc w:val="both"/>
+            </w:pPr>
+          </w:p>
+          <w:p>
+            <w:pPr>
+              <w:pStyle w:val="ListParagraph"/>
+              <w:ind w:left="459"/>
+              <w:jc w:val="both"/>
+            </w:pPr>
+            <w:r>
+              <w:t>public class Employee {</w:t>
+            </w:r>
+          </w:p>
+          <w:p>
+            <w:pPr>
+              <w:pStyle w:val="ListParagraph"/>
+              <w:ind w:left="459"/>
+              <w:jc w:val="both"/>
+            </w:pPr>
+            <w:r>
+              <w:t xml:space="preserve">    private String </w:t>
+            </w:r>
+            <w:proofErr w:type="gramStart"/>
+            <w:r>
+              <w:t>name;</w:t>
+            </w:r>
+            <w:proofErr w:type="gramEnd"/>
+          </w:p>
+          <w:p>
+            <w:pPr>
+              <w:pStyle w:val="ListParagraph"/>
+              <w:ind w:left="459"/>
+              <w:jc w:val="both"/>
+            </w:pPr>
+            <w:r>
+              <w:t xml:space="preserve">    private int </w:t>
+            </w:r>
+            <w:proofErr w:type="gramStart"/>
+            <w:r>
+              <w:t>salary;</w:t>
+            </w:r>
+            <w:proofErr w:type="gramEnd"/>
+          </w:p>
+          <w:p>
+            <w:pPr>
+              <w:pStyle w:val="ListParagraph"/>
+              <w:ind w:left="459"/>
+              <w:jc w:val="both"/>
+            </w:pPr>
+          </w:p>
+          <w:p>
+            <w:pPr>
+              <w:pStyle w:val="ListParagraph"/>
+              <w:ind w:left="459"/>
+              <w:jc w:val="both"/>
+            </w:pPr>
+            <w:r>
+              <w:t xml:space="preserve">    //constructor</w:t>
+            </w:r>
+          </w:p>
+          <w:p>
+            <w:pPr>
+              <w:pStyle w:val="ListParagraph"/>
+              <w:ind w:left="459"/>
+              <w:jc w:val="both"/>
+            </w:pPr>
+            <w:r>
+              <w:t xml:space="preserve">    public </w:t>
+            </w:r>
+            <w:proofErr w:type="gramStart"/>
+            <w:r>
+              <w:t>Employee(</w:t>
+            </w:r>
+            <w:proofErr w:type="gramEnd"/>
+            <w:r>
+              <w:t>String name, int salary) {</w:t>
+            </w:r>
+          </w:p>
+          <w:p>
+            <w:pPr>
+              <w:pStyle w:val="ListParagraph"/>
+              <w:ind w:left="459"/>
+              <w:jc w:val="both"/>
+            </w:pPr>
+            <w:r>
+              <w:t xml:space="preserve">        this.name = </w:t>
+            </w:r>
+            <w:proofErr w:type="gramStart"/>
+            <w:r>
+              <w:t>name;</w:t>
+            </w:r>
+            <w:proofErr w:type="gramEnd"/>
+          </w:p>
+          <w:p>
+            <w:pPr>
+              <w:pStyle w:val="ListParagraph"/>
+              <w:ind w:left="459"/>
+              <w:jc w:val="both"/>
+            </w:pPr>
+            <w:r>
+              <w:t xml:space="preserve">        </w:t>
+            </w:r>
+            <w:proofErr w:type="spellStart"/>
+            <w:proofErr w:type="gramStart"/>
+            <w:r>
+              <w:t>this.salary</w:t>
+            </w:r>
+            <w:proofErr w:type="spellEnd"/>
+            <w:proofErr w:type="gramEnd"/>
+            <w:r>
+              <w:t xml:space="preserve"> = </w:t>
+            </w:r>
+            <w:proofErr w:type="gramStart"/>
+            <w:r>
+              <w:t>salary;</w:t>
+            </w:r>
+            <w:proofErr w:type="gramEnd"/>
+          </w:p>
+          <w:p>
+            <w:pPr>
+              <w:pStyle w:val="ListParagraph"/>
+              <w:ind w:left="459"/>
+              <w:jc w:val="both"/>
+            </w:pPr>
+            <w:r>
+              <w:t xml:space="preserve">    }</w:t>
+            </w:r>
+          </w:p>
+          <w:p>
+            <w:pPr>
+              <w:pStyle w:val="ListParagraph"/>
+              <w:ind w:left="459"/>
+              <w:jc w:val="both"/>
+            </w:pPr>
+          </w:p>
+          <w:p>
+            <w:pPr>
+              <w:pStyle w:val="ListParagraph"/>
+              <w:ind w:left="459"/>
+              <w:jc w:val="both"/>
+            </w:pPr>
+            <w:r>
+              <w:t xml:space="preserve">    //getter</w:t>
+            </w:r>
+          </w:p>
+          <w:p>
+            <w:pPr>
+              <w:pStyle w:val="ListParagraph"/>
+              <w:ind w:left="459"/>
+              <w:jc w:val="both"/>
+            </w:pPr>
+            <w:r>
+              <w:t xml:space="preserve">    public String </w:t>
+            </w:r>
+            <w:proofErr w:type="spellStart"/>
+            <w:proofErr w:type="gramStart"/>
+            <w:r>
+              <w:t>getName</w:t>
+            </w:r>
+            <w:proofErr w:type="spellEnd"/>
+            <w:r>
+              <w:t>(</w:t>
+            </w:r>
+            <w:proofErr w:type="gramEnd"/>
+            <w:r>
+              <w:t>) {</w:t>
+            </w:r>
+          </w:p>
+          <w:p>
+            <w:pPr>
+              <w:pStyle w:val="ListParagraph"/>
+              <w:ind w:left="459"/>
+              <w:jc w:val="both"/>
+            </w:pPr>
+            <w:r>
+              <w:t xml:space="preserve">        return </w:t>
+            </w:r>
+            <w:proofErr w:type="gramStart"/>
+            <w:r>
+              <w:t>name;</w:t>
+            </w:r>
+            <w:proofErr w:type="gramEnd"/>
+          </w:p>
+          <w:p>
+            <w:pPr>
+              <w:pStyle w:val="ListParagraph"/>
+              <w:ind w:left="459"/>
+              <w:jc w:val="both"/>
+            </w:pPr>
+            <w:r>
+              <w:t xml:space="preserve">    }</w:t>
+            </w:r>
+          </w:p>
+          <w:p>
+            <w:pPr>
+              <w:pStyle w:val="ListParagraph"/>
+              <w:ind w:left="459"/>
+              <w:jc w:val="both"/>
+            </w:pPr>
+          </w:p>
+          <w:p>
+            <w:pPr>
+              <w:pStyle w:val="ListParagraph"/>
+              <w:ind w:left="459"/>
+              <w:jc w:val="both"/>
+            </w:pPr>
+            <w:r>
+              <w:t xml:space="preserve">    public int </w:t>
+            </w:r>
+            <w:proofErr w:type="spellStart"/>
+            <w:proofErr w:type="gramStart"/>
+            <w:r>
+              <w:t>getSalary</w:t>
+            </w:r>
+            <w:proofErr w:type="spellEnd"/>
+            <w:r>
+              <w:t>(</w:t>
+            </w:r>
+            <w:proofErr w:type="gramEnd"/>
+            <w:r>
+              <w:t>) {</w:t>
+            </w:r>
+          </w:p>
+          <w:p>
+            <w:pPr>
+              <w:pStyle w:val="ListParagraph"/>
+              <w:ind w:left="459"/>
+              <w:jc w:val="both"/>
+            </w:pPr>
+            <w:r>
+              <w:t xml:space="preserve">        return </w:t>
+            </w:r>
+            <w:proofErr w:type="gramStart"/>
+            <w:r>
+              <w:t>salary;</w:t>
+            </w:r>
+            <w:proofErr w:type="gramEnd"/>
+          </w:p>
+          <w:p>
+            <w:pPr>
+              <w:pStyle w:val="ListParagraph"/>
+              <w:ind w:left="459"/>
+              <w:jc w:val="both"/>
+            </w:pPr>
+            <w:r>
+              <w:t xml:space="preserve">    }</w:t>
+            </w:r>
+          </w:p>
+          <w:p>
+            <w:pPr>
+              <w:pStyle w:val="ListParagraph"/>
+              <w:ind w:left="459"/>
+              <w:jc w:val="both"/>
+            </w:pPr>
+          </w:p>
+          <w:p>
+            <w:pPr>
+              <w:pStyle w:val="ListParagraph"/>
+              <w:ind w:left="459"/>
+              <w:jc w:val="both"/>
+            </w:pPr>
+            <w:r>
+              <w:t xml:space="preserve">    //output</w:t>
+            </w:r>
+          </w:p>
+          <w:p>
+            <w:pPr>
+              <w:pStyle w:val="ListParagraph"/>
+              <w:ind w:left="459"/>
+              <w:jc w:val="both"/>
+            </w:pPr>
+            <w:r>
+              <w:t xml:space="preserve">    public String </w:t>
+            </w:r>
+            <w:proofErr w:type="spellStart"/>
+            <w:proofErr w:type="gramStart"/>
+            <w:r>
+              <w:t>toString</w:t>
+            </w:r>
+            <w:proofErr w:type="spellEnd"/>
+            <w:r>
+              <w:t>(</w:t>
+            </w:r>
+            <w:proofErr w:type="gramEnd"/>
+            <w:r>
+              <w:t>) {</w:t>
+            </w:r>
+          </w:p>
+          <w:p>
+            <w:pPr>
+              <w:pStyle w:val="ListParagraph"/>
+              <w:ind w:left="459"/>
+              <w:jc w:val="both"/>
+            </w:pPr>
+            <w:r>
+              <w:t xml:space="preserve">        return "</w:t>
+            </w:r>
+            <w:proofErr w:type="gramStart"/>
+            <w:r>
+              <w:t>Employee{</w:t>
+            </w:r>
+            <w:proofErr w:type="gramEnd"/>
+            <w:r>
+              <w:t>Name: " + name + ", Salary: " + salary + "}</w:t>
+            </w:r>
+            <w:proofErr w:type="gramStart"/>
+            <w:r>
+              <w:t>";</w:t>
+            </w:r>
+            <w:proofErr w:type="gramEnd"/>
+          </w:p>
+          <w:p>
+            <w:pPr>
+              <w:pStyle w:val="ListParagraph"/>
+              <w:ind w:left="459"/>
+              <w:jc w:val="both"/>
+            </w:pPr>
+            <w:r>
+              <w:t xml:space="preserve">    }</w:t>
+            </w:r>
+          </w:p>
+          <w:p>
+            <w:pPr>
+              <w:pStyle w:val="ListParagraph"/>
+              <w:ind w:left="459"/>
+              <w:jc w:val="both"/>
+            </w:pPr>
+          </w:p>
+          <w:p>
+            <w:pPr>
+              <w:pStyle w:val="ListParagraph"/>
+              <w:ind w:left="459"/>
+              <w:jc w:val="both"/>
+            </w:pPr>
+            <w:r>
+              <w:lastRenderedPageBreak/>
+              <w:t>}</w:t>
+            </w:r>
           </w:p>
         </w:tc>
       </w:tr>
@@ -2302,6 +3326,7 @@
                 <w:b/>
                 <w:bCs/>
               </w:rPr>
+              <w:lastRenderedPageBreak/>
               <w:t>Screenshot Hasil</w:t>
             </w:r>
           </w:p>
@@ -2319,6 +3344,47 @@
                 <w:bCs/>
               </w:rPr>
             </w:pPr>
+            <w:r>
+              <w:rPr>
+                <w:b/>
+                <w:bCs/>
+              </w:rPr>
+              <w:drawing>
+                <wp:inline distT="0" distB="0" distL="0" distR="0" wp14:anchorId="792A64D5" wp14:editId="6A6B4520">
+                  <wp:extent cx="5588000" cy="3141980"/>
+                  <wp:effectExtent l="0" t="0" r="0" b="1270"/>
+                  <wp:docPr id="1157268935" name="Picture 1"/>
+                  <wp:cNvGraphicFramePr>
+                    <a:graphicFrameLocks xmlns:a="http://schemas.openxmlformats.org/drawingml/2006/main" noChangeAspect="1"/>
+                  </wp:cNvGraphicFramePr>
+                  <a:graphic xmlns:a="http://schemas.openxmlformats.org/drawingml/2006/main">
+                    <a:graphicData uri="http://schemas.openxmlformats.org/drawingml/2006/picture">
+                      <pic:pic xmlns:pic="http://schemas.openxmlformats.org/drawingml/2006/picture">
+                        <pic:nvPicPr>
+                          <pic:cNvPr id="1157268935" name=""/>
+                          <pic:cNvPicPr/>
+                        </pic:nvPicPr>
+                        <pic:blipFill>
+                          <a:blip r:embed="rId7"/>
+                          <a:stretch>
+                            <a:fillRect/>
+                          </a:stretch>
+                        </pic:blipFill>
+                        <pic:spPr>
+                          <a:xfrm>
+                            <a:off x="0" y="0"/>
+                            <a:ext cx="5588000" cy="3141980"/>
+                          </a:xfrm>
+                          <a:prstGeom prst="rect">
+                            <a:avLst/>
+                          </a:prstGeom>
+                        </pic:spPr>
+                      </pic:pic>
+                    </a:graphicData>
+                  </a:graphic>
+                </wp:inline>
+              </w:drawing>
+            </w:r>
           </w:p>
         </w:tc>
       </w:tr>
@@ -3946,8 +5012,1121 @@
           </w:tcPr>
           <w:p>
             <w:pPr>
-              <w:jc w:val="both"/>
-            </w:pPr>
+              <w:pStyle w:val="ListParagraph"/>
+              <w:numPr>
+                <w:ilvl w:val="6"/>
+                <w:numId w:val="1"/>
+              </w:numPr>
+              <w:ind w:left="459"/>
+              <w:jc w:val="both"/>
+              <w:rPr>
+                <w:b/>
+                <w:bCs/>
+              </w:rPr>
+            </w:pPr>
+            <w:r>
+              <w:rPr>
+                <w:b/>
+                <w:bCs/>
+              </w:rPr>
+              <w:t>ProbelemTwo.java</w:t>
+            </w:r>
+          </w:p>
+          <w:p>
+            <w:pPr>
+              <w:pStyle w:val="ListParagraph"/>
+              <w:ind w:left="459"/>
+              <w:jc w:val="both"/>
+            </w:pPr>
+            <w:r>
+              <w:t xml:space="preserve">package </w:t>
+            </w:r>
+            <w:proofErr w:type="spellStart"/>
+            <w:proofErr w:type="gramStart"/>
+            <w:r>
+              <w:t>JavaProblems</w:t>
+            </w:r>
+            <w:proofErr w:type="spellEnd"/>
+            <w:r>
+              <w:t>;</w:t>
+            </w:r>
+            <w:proofErr w:type="gramEnd"/>
+          </w:p>
+          <w:p>
+            <w:pPr>
+              <w:pStyle w:val="ListParagraph"/>
+              <w:ind w:left="459"/>
+              <w:jc w:val="both"/>
+            </w:pPr>
+          </w:p>
+          <w:p>
+            <w:pPr>
+              <w:pStyle w:val="ListParagraph"/>
+              <w:ind w:left="459"/>
+              <w:jc w:val="both"/>
+            </w:pPr>
+            <w:r>
+              <w:t xml:space="preserve">import </w:t>
+            </w:r>
+            <w:proofErr w:type="spellStart"/>
+            <w:proofErr w:type="gramStart"/>
+            <w:r>
+              <w:t>java.util</w:t>
+            </w:r>
+            <w:proofErr w:type="gramEnd"/>
+            <w:r>
+              <w:t>.</w:t>
+            </w:r>
+            <w:proofErr w:type="gramStart"/>
+            <w:r>
+              <w:t>Arrays</w:t>
+            </w:r>
+            <w:proofErr w:type="spellEnd"/>
+            <w:r>
+              <w:t>;</w:t>
+            </w:r>
+            <w:proofErr w:type="gramEnd"/>
+          </w:p>
+          <w:p>
+            <w:pPr>
+              <w:pStyle w:val="ListParagraph"/>
+              <w:ind w:left="459"/>
+              <w:jc w:val="both"/>
+            </w:pPr>
+            <w:r>
+              <w:t xml:space="preserve">import </w:t>
+            </w:r>
+            <w:proofErr w:type="spellStart"/>
+            <w:proofErr w:type="gramStart"/>
+            <w:r>
+              <w:t>java.util</w:t>
+            </w:r>
+            <w:proofErr w:type="gramEnd"/>
+            <w:r>
+              <w:t>.</w:t>
+            </w:r>
+            <w:proofErr w:type="gramStart"/>
+            <w:r>
+              <w:t>List</w:t>
+            </w:r>
+            <w:proofErr w:type="spellEnd"/>
+            <w:r>
+              <w:t>;</w:t>
+            </w:r>
+            <w:proofErr w:type="gramEnd"/>
+          </w:p>
+          <w:p>
+            <w:pPr>
+              <w:pStyle w:val="ListParagraph"/>
+              <w:ind w:left="459"/>
+              <w:jc w:val="both"/>
+            </w:pPr>
+            <w:r>
+              <w:t xml:space="preserve">import </w:t>
+            </w:r>
+            <w:proofErr w:type="spellStart"/>
+            <w:proofErr w:type="gramStart"/>
+            <w:r>
+              <w:t>java.util</w:t>
+            </w:r>
+            <w:proofErr w:type="gramEnd"/>
+            <w:r>
+              <w:t>.</w:t>
+            </w:r>
+            <w:proofErr w:type="gramStart"/>
+            <w:r>
+              <w:t>stream.Collectors</w:t>
+            </w:r>
+            <w:proofErr w:type="spellEnd"/>
+            <w:proofErr w:type="gramEnd"/>
+            <w:r>
+              <w:t>;</w:t>
+            </w:r>
+          </w:p>
+          <w:p>
+            <w:pPr>
+              <w:pStyle w:val="ListParagraph"/>
+              <w:ind w:left="459"/>
+              <w:jc w:val="both"/>
+            </w:pPr>
+          </w:p>
+          <w:p>
+            <w:pPr>
+              <w:pStyle w:val="ListParagraph"/>
+              <w:ind w:left="459"/>
+              <w:jc w:val="both"/>
+            </w:pPr>
+            <w:r>
+              <w:t xml:space="preserve">public class </w:t>
+            </w:r>
+            <w:proofErr w:type="spellStart"/>
+            <w:r>
+              <w:t>ProblemTwo</w:t>
+            </w:r>
+            <w:proofErr w:type="spellEnd"/>
+            <w:r>
+              <w:t xml:space="preserve"> {</w:t>
+            </w:r>
+          </w:p>
+          <w:p>
+            <w:pPr>
+              <w:pStyle w:val="ListParagraph"/>
+              <w:ind w:left="459"/>
+              <w:jc w:val="both"/>
+            </w:pPr>
+            <w:r>
+              <w:t xml:space="preserve">    public static void </w:t>
+            </w:r>
+            <w:proofErr w:type="gramStart"/>
+            <w:r>
+              <w:t>main(String[</w:t>
+            </w:r>
+            <w:proofErr w:type="gramEnd"/>
+            <w:r>
+              <w:t xml:space="preserve">] </w:t>
+            </w:r>
+            <w:proofErr w:type="spellStart"/>
+            <w:r>
+              <w:t>args</w:t>
+            </w:r>
+            <w:proofErr w:type="spellEnd"/>
+            <w:r>
+              <w:t>) {</w:t>
+            </w:r>
+          </w:p>
+          <w:p>
+            <w:pPr>
+              <w:pStyle w:val="ListParagraph"/>
+              <w:ind w:left="459"/>
+              <w:jc w:val="both"/>
+            </w:pPr>
+          </w:p>
+          <w:p>
+            <w:pPr>
+              <w:pStyle w:val="ListParagraph"/>
+              <w:ind w:left="459"/>
+              <w:jc w:val="both"/>
+            </w:pPr>
+            <w:r>
+              <w:t xml:space="preserve">        List&lt;Student&gt; students = </w:t>
+            </w:r>
+            <w:proofErr w:type="spellStart"/>
+            <w:r>
+              <w:t>Arrays.asList</w:t>
+            </w:r>
+            <w:proofErr w:type="spellEnd"/>
+            <w:r>
+              <w:t>(</w:t>
+            </w:r>
+          </w:p>
+          <w:p>
+            <w:pPr>
+              <w:pStyle w:val="ListParagraph"/>
+              <w:ind w:left="459"/>
+              <w:jc w:val="both"/>
+            </w:pPr>
+            <w:r>
+              <w:t xml:space="preserve">                new </w:t>
+            </w:r>
+            <w:proofErr w:type="gramStart"/>
+            <w:r>
+              <w:t>Student(</w:t>
+            </w:r>
+            <w:proofErr w:type="gramEnd"/>
+            <w:r>
+              <w:t>101, "Joe"),</w:t>
+            </w:r>
+          </w:p>
+          <w:p>
+            <w:pPr>
+              <w:pStyle w:val="ListParagraph"/>
+              <w:ind w:left="459"/>
+              <w:jc w:val="both"/>
+            </w:pPr>
+            <w:r>
+              <w:t xml:space="preserve">                new </w:t>
+            </w:r>
+            <w:proofErr w:type="gramStart"/>
+            <w:r>
+              <w:t>Student(</w:t>
+            </w:r>
+            <w:proofErr w:type="gramEnd"/>
+            <w:r>
+              <w:t>103, "Zulkifli"),</w:t>
+            </w:r>
+          </w:p>
+          <w:p>
+            <w:pPr>
+              <w:pStyle w:val="ListParagraph"/>
+              <w:ind w:left="459"/>
+              <w:jc w:val="both"/>
+            </w:pPr>
+            <w:r>
+              <w:t xml:space="preserve">                new </w:t>
+            </w:r>
+            <w:proofErr w:type="gramStart"/>
+            <w:r>
+              <w:t>Student(</w:t>
+            </w:r>
+            <w:proofErr w:type="gramEnd"/>
+            <w:r>
+              <w:t>102, "Riza"),</w:t>
+            </w:r>
+          </w:p>
+          <w:p>
+            <w:pPr>
+              <w:pStyle w:val="ListParagraph"/>
+              <w:ind w:left="459"/>
+              <w:jc w:val="both"/>
+            </w:pPr>
+            <w:r>
+              <w:t xml:space="preserve">                new </w:t>
+            </w:r>
+            <w:proofErr w:type="gramStart"/>
+            <w:r>
+              <w:t>Student(</w:t>
+            </w:r>
+            <w:proofErr w:type="gramEnd"/>
+            <w:r>
+              <w:t>104, "Alice"),</w:t>
+            </w:r>
+          </w:p>
+          <w:p>
+            <w:pPr>
+              <w:pStyle w:val="ListParagraph"/>
+              <w:ind w:left="459"/>
+              <w:jc w:val="both"/>
+            </w:pPr>
+            <w:r>
+              <w:t xml:space="preserve">                new </w:t>
+            </w:r>
+            <w:proofErr w:type="gramStart"/>
+            <w:r>
+              <w:t>Student(</w:t>
+            </w:r>
+            <w:proofErr w:type="gramEnd"/>
+            <w:r>
+              <w:t>105, "Joshua")</w:t>
+            </w:r>
+          </w:p>
+          <w:p>
+            <w:pPr>
+              <w:pStyle w:val="ListParagraph"/>
+              <w:ind w:left="459"/>
+              <w:jc w:val="both"/>
+            </w:pPr>
+            <w:r>
+              <w:t xml:space="preserve">        </w:t>
+            </w:r>
+            <w:proofErr w:type="gramStart"/>
+            <w:r>
+              <w:t>);</w:t>
+            </w:r>
+            <w:proofErr w:type="gramEnd"/>
+          </w:p>
+          <w:p>
+            <w:pPr>
+              <w:pStyle w:val="ListParagraph"/>
+              <w:ind w:left="459"/>
+              <w:jc w:val="both"/>
+            </w:pPr>
+          </w:p>
+          <w:p>
+            <w:pPr>
+              <w:pStyle w:val="ListParagraph"/>
+              <w:ind w:left="459"/>
+              <w:jc w:val="both"/>
+            </w:pPr>
+            <w:r>
+              <w:t xml:space="preserve">        List&lt;Student&gt; </w:t>
+            </w:r>
+            <w:proofErr w:type="spellStart"/>
+            <w:r>
+              <w:t>ans</w:t>
+            </w:r>
+            <w:proofErr w:type="spellEnd"/>
+            <w:r>
+              <w:t xml:space="preserve"> = </w:t>
+            </w:r>
+            <w:proofErr w:type="spellStart"/>
+            <w:proofErr w:type="gramStart"/>
+            <w:r>
+              <w:t>students.stream</w:t>
+            </w:r>
+            <w:proofErr w:type="spellEnd"/>
+            <w:proofErr w:type="gramEnd"/>
+            <w:r>
+              <w:t xml:space="preserve">() // </w:t>
+            </w:r>
+            <w:proofErr w:type="spellStart"/>
+            <w:r>
+              <w:t>Membuka</w:t>
+            </w:r>
+            <w:proofErr w:type="spellEnd"/>
+            <w:r>
+              <w:t xml:space="preserve"> stream</w:t>
+            </w:r>
+          </w:p>
+          <w:p>
+            <w:pPr>
+              <w:pStyle w:val="ListParagraph"/>
+              <w:ind w:left="459"/>
+              <w:jc w:val="both"/>
+            </w:pPr>
+            <w:r>
+              <w:t xml:space="preserve">                </w:t>
+            </w:r>
+            <w:proofErr w:type="gramStart"/>
+            <w:r>
+              <w:t>.sorted</w:t>
+            </w:r>
+            <w:proofErr w:type="gramEnd"/>
+            <w:r>
+              <w:t xml:space="preserve">((s1, s2) -&gt; </w:t>
+            </w:r>
+            <w:proofErr w:type="gramStart"/>
+            <w:r>
+              <w:t xml:space="preserve">{  </w:t>
+            </w:r>
+            <w:proofErr w:type="gramEnd"/>
+            <w:r>
+              <w:t xml:space="preserve">     // </w:t>
+            </w:r>
+            <w:proofErr w:type="spellStart"/>
+            <w:r>
+              <w:t>Melakukan</w:t>
+            </w:r>
+            <w:proofErr w:type="spellEnd"/>
+            <w:r>
+              <w:t xml:space="preserve"> </w:t>
+            </w:r>
+            <w:proofErr w:type="spellStart"/>
+            <w:r>
+              <w:t>pengurutan</w:t>
+            </w:r>
+            <w:proofErr w:type="spellEnd"/>
+          </w:p>
+          <w:p>
+            <w:pPr>
+              <w:pStyle w:val="ListParagraph"/>
+              <w:ind w:left="459"/>
+              <w:jc w:val="both"/>
+            </w:pPr>
+            <w:r>
+              <w:t xml:space="preserve">                    </w:t>
+            </w:r>
+          </w:p>
+          <w:p>
+            <w:pPr>
+              <w:pStyle w:val="ListParagraph"/>
+              <w:ind w:left="459"/>
+              <w:jc w:val="both"/>
+            </w:pPr>
+            <w:r>
+              <w:t xml:space="preserve">                    // Logika: Jika nama </w:t>
+            </w:r>
+            <w:proofErr w:type="spellStart"/>
+            <w:r>
+              <w:t>sama</w:t>
+            </w:r>
+            <w:proofErr w:type="spellEnd"/>
+            <w:r>
+              <w:t xml:space="preserve">, </w:t>
+            </w:r>
+            <w:proofErr w:type="spellStart"/>
+            <w:r>
+              <w:t>bandingkan</w:t>
+            </w:r>
+            <w:proofErr w:type="spellEnd"/>
+            <w:r>
+              <w:t xml:space="preserve"> ID</w:t>
+            </w:r>
+          </w:p>
+          <w:p>
+            <w:pPr>
+              <w:pStyle w:val="ListParagraph"/>
+              <w:ind w:left="459"/>
+              <w:jc w:val="both"/>
+            </w:pPr>
+            <w:r>
+              <w:t xml:space="preserve">                    if (s</w:t>
+            </w:r>
+            <w:proofErr w:type="gramStart"/>
+            <w:r>
+              <w:t>1.getName</w:t>
+            </w:r>
+            <w:proofErr w:type="gramEnd"/>
+            <w:r>
+              <w:t>(</w:t>
+            </w:r>
+            <w:proofErr w:type="gramStart"/>
+            <w:r>
+              <w:t>).</w:t>
+            </w:r>
+            <w:proofErr w:type="spellStart"/>
+            <w:r>
+              <w:t>equalsIgnoreCase</w:t>
+            </w:r>
+            <w:proofErr w:type="spellEnd"/>
+            <w:proofErr w:type="gramEnd"/>
+            <w:r>
+              <w:t>(s</w:t>
+            </w:r>
+            <w:proofErr w:type="gramStart"/>
+            <w:r>
+              <w:t>2.getName</w:t>
+            </w:r>
+            <w:proofErr w:type="gramEnd"/>
+            <w:r>
+              <w:t>())) {</w:t>
+            </w:r>
+          </w:p>
+          <w:p>
+            <w:pPr>
+              <w:pStyle w:val="ListParagraph"/>
+              <w:ind w:left="459"/>
+              <w:jc w:val="both"/>
+            </w:pPr>
+            <w:r>
+              <w:lastRenderedPageBreak/>
+              <w:t xml:space="preserve">                        return </w:t>
+            </w:r>
+            <w:proofErr w:type="spellStart"/>
+            <w:r>
+              <w:t>Integer.compare</w:t>
+            </w:r>
+            <w:proofErr w:type="spellEnd"/>
+            <w:r>
+              <w:t>(s</w:t>
+            </w:r>
+            <w:proofErr w:type="gramStart"/>
+            <w:r>
+              <w:t>1.getId</w:t>
+            </w:r>
+            <w:proofErr w:type="gramEnd"/>
+            <w:r>
+              <w:t>(), s</w:t>
+            </w:r>
+            <w:proofErr w:type="gramStart"/>
+            <w:r>
+              <w:t>2.getId</w:t>
+            </w:r>
+            <w:proofErr w:type="gramEnd"/>
+            <w:r>
+              <w:t>()</w:t>
+            </w:r>
+            <w:proofErr w:type="gramStart"/>
+            <w:r>
+              <w:t>);</w:t>
+            </w:r>
+            <w:proofErr w:type="gramEnd"/>
+          </w:p>
+          <w:p>
+            <w:pPr>
+              <w:pStyle w:val="ListParagraph"/>
+              <w:ind w:left="459"/>
+              <w:jc w:val="both"/>
+            </w:pPr>
+            <w:r>
+              <w:t xml:space="preserve">                    } </w:t>
+            </w:r>
+          </w:p>
+          <w:p>
+            <w:pPr>
+              <w:pStyle w:val="ListParagraph"/>
+              <w:ind w:left="459"/>
+              <w:jc w:val="both"/>
+            </w:pPr>
+            <w:r>
+              <w:t xml:space="preserve">                    // Jika nama </w:t>
+            </w:r>
+            <w:proofErr w:type="spellStart"/>
+            <w:r>
+              <w:t>berbeda</w:t>
+            </w:r>
+            <w:proofErr w:type="spellEnd"/>
+            <w:r>
+              <w:t xml:space="preserve">, </w:t>
+            </w:r>
+            <w:proofErr w:type="spellStart"/>
+            <w:r>
+              <w:t>bandingkan</w:t>
+            </w:r>
+            <w:proofErr w:type="spellEnd"/>
+            <w:r>
+              <w:t xml:space="preserve"> Nama</w:t>
+            </w:r>
+          </w:p>
+          <w:p>
+            <w:pPr>
+              <w:pStyle w:val="ListParagraph"/>
+              <w:ind w:left="459"/>
+              <w:jc w:val="both"/>
+            </w:pPr>
+            <w:r>
+              <w:t xml:space="preserve">                    else {</w:t>
+            </w:r>
+          </w:p>
+          <w:p>
+            <w:pPr>
+              <w:pStyle w:val="ListParagraph"/>
+              <w:ind w:left="459"/>
+              <w:jc w:val="both"/>
+            </w:pPr>
+            <w:r>
+              <w:t xml:space="preserve">                        return s</w:t>
+            </w:r>
+            <w:proofErr w:type="gramStart"/>
+            <w:r>
+              <w:t>1.getName</w:t>
+            </w:r>
+            <w:proofErr w:type="gramEnd"/>
+            <w:r>
+              <w:t>(</w:t>
+            </w:r>
+            <w:proofErr w:type="gramStart"/>
+            <w:r>
+              <w:t>).</w:t>
+            </w:r>
+            <w:proofErr w:type="spellStart"/>
+            <w:r>
+              <w:t>compareTo</w:t>
+            </w:r>
+            <w:proofErr w:type="spellEnd"/>
+            <w:proofErr w:type="gramEnd"/>
+            <w:r>
+              <w:t>(s</w:t>
+            </w:r>
+            <w:proofErr w:type="gramStart"/>
+            <w:r>
+              <w:t>2.getName</w:t>
+            </w:r>
+            <w:proofErr w:type="gramEnd"/>
+            <w:r>
+              <w:t>()</w:t>
+            </w:r>
+            <w:proofErr w:type="gramStart"/>
+            <w:r>
+              <w:t>);</w:t>
+            </w:r>
+            <w:proofErr w:type="gramEnd"/>
+          </w:p>
+          <w:p>
+            <w:pPr>
+              <w:pStyle w:val="ListParagraph"/>
+              <w:ind w:left="459"/>
+              <w:jc w:val="both"/>
+            </w:pPr>
+            <w:r>
+              <w:t xml:space="preserve">                    }</w:t>
+            </w:r>
+          </w:p>
+          <w:p>
+            <w:pPr>
+              <w:pStyle w:val="ListParagraph"/>
+              <w:ind w:left="459"/>
+              <w:jc w:val="both"/>
+            </w:pPr>
+            <w:r>
+              <w:t xml:space="preserve">                })</w:t>
+            </w:r>
+          </w:p>
+          <w:p>
+            <w:pPr>
+              <w:pStyle w:val="ListParagraph"/>
+              <w:ind w:left="459"/>
+              <w:jc w:val="both"/>
+            </w:pPr>
+            <w:r>
+              <w:t xml:space="preserve">                </w:t>
+            </w:r>
+            <w:proofErr w:type="gramStart"/>
+            <w:r>
+              <w:t>.collect</w:t>
+            </w:r>
+            <w:proofErr w:type="gramEnd"/>
+            <w:r>
+              <w:t>(</w:t>
+            </w:r>
+            <w:proofErr w:type="spellStart"/>
+            <w:r>
+              <w:t>Collectors.toList</w:t>
+            </w:r>
+            <w:proofErr w:type="spellEnd"/>
+            <w:r>
+              <w:t xml:space="preserve">()); // </w:t>
+            </w:r>
+            <w:proofErr w:type="spellStart"/>
+            <w:r>
+              <w:t>Mengumpulkan</w:t>
+            </w:r>
+            <w:proofErr w:type="spellEnd"/>
+            <w:r>
+              <w:t xml:space="preserve"> </w:t>
+            </w:r>
+            <w:proofErr w:type="spellStart"/>
+            <w:r>
+              <w:t>hasil</w:t>
+            </w:r>
+            <w:proofErr w:type="spellEnd"/>
+          </w:p>
+          <w:p>
+            <w:pPr>
+              <w:pStyle w:val="ListParagraph"/>
+              <w:ind w:left="459"/>
+              <w:jc w:val="both"/>
+            </w:pPr>
+          </w:p>
+          <w:p>
+            <w:pPr>
+              <w:pStyle w:val="ListParagraph"/>
+              <w:ind w:left="459"/>
+              <w:jc w:val="both"/>
+            </w:pPr>
+            <w:r>
+              <w:t xml:space="preserve">        for (Student </w:t>
+            </w:r>
+            <w:proofErr w:type="spellStart"/>
+            <w:proofErr w:type="gramStart"/>
+            <w:r>
+              <w:t>student</w:t>
+            </w:r>
+            <w:proofErr w:type="spellEnd"/>
+            <w:r>
+              <w:t xml:space="preserve"> :</w:t>
+            </w:r>
+            <w:proofErr w:type="gramEnd"/>
+            <w:r>
+              <w:t xml:space="preserve"> </w:t>
+            </w:r>
+            <w:proofErr w:type="spellStart"/>
+            <w:r>
+              <w:t>ans</w:t>
+            </w:r>
+            <w:proofErr w:type="spellEnd"/>
+            <w:r>
+              <w:t>) {</w:t>
+            </w:r>
+          </w:p>
+          <w:p>
+            <w:pPr>
+              <w:pStyle w:val="ListParagraph"/>
+              <w:ind w:left="459"/>
+              <w:jc w:val="both"/>
+            </w:pPr>
+            <w:r>
+              <w:t xml:space="preserve">            </w:t>
+            </w:r>
+            <w:proofErr w:type="spellStart"/>
+            <w:r>
+              <w:t>System.out.println</w:t>
+            </w:r>
+            <w:proofErr w:type="spellEnd"/>
+            <w:r>
+              <w:t>(student</w:t>
+            </w:r>
+            <w:proofErr w:type="gramStart"/>
+            <w:r>
+              <w:t>);</w:t>
+            </w:r>
+            <w:proofErr w:type="gramEnd"/>
+          </w:p>
+          <w:p>
+            <w:pPr>
+              <w:pStyle w:val="ListParagraph"/>
+              <w:ind w:left="459"/>
+              <w:jc w:val="both"/>
+            </w:pPr>
+            <w:r>
+              <w:t xml:space="preserve">        }</w:t>
+            </w:r>
+          </w:p>
+          <w:p>
+            <w:pPr>
+              <w:pStyle w:val="ListParagraph"/>
+              <w:ind w:left="459"/>
+              <w:jc w:val="both"/>
+            </w:pPr>
+            <w:r>
+              <w:t xml:space="preserve">    }</w:t>
+            </w:r>
+          </w:p>
+          <w:p>
+            <w:pPr>
+              <w:pStyle w:val="ListParagraph"/>
+              <w:ind w:left="459"/>
+              <w:jc w:val="both"/>
+            </w:pPr>
+            <w:r>
+              <w:t>}</w:t>
+            </w:r>
+          </w:p>
+          <w:p>
+            <w:pPr>
+              <w:pStyle w:val="ListParagraph"/>
+              <w:numPr>
+                <w:ilvl w:val="6"/>
+                <w:numId w:val="1"/>
+              </w:numPr>
+              <w:ind w:left="459"/>
+              <w:jc w:val="both"/>
+              <w:rPr>
+                <w:b/>
+                <w:bCs/>
+              </w:rPr>
+            </w:pPr>
+            <w:r>
+              <w:rPr>
+                <w:b/>
+                <w:bCs/>
+              </w:rPr>
+              <w:t>Student.java</w:t>
+            </w:r>
+          </w:p>
+          <w:p>
+            <w:pPr>
+              <w:pStyle w:val="ListParagraph"/>
+              <w:ind w:left="459"/>
+              <w:jc w:val="both"/>
+            </w:pPr>
+            <w:r>
+              <w:t xml:space="preserve">package </w:t>
+            </w:r>
+            <w:proofErr w:type="spellStart"/>
+            <w:proofErr w:type="gramStart"/>
+            <w:r>
+              <w:t>JavaProblems</w:t>
+            </w:r>
+            <w:proofErr w:type="spellEnd"/>
+            <w:r>
+              <w:t>;</w:t>
+            </w:r>
+            <w:proofErr w:type="gramEnd"/>
+          </w:p>
+          <w:p>
+            <w:pPr>
+              <w:pStyle w:val="ListParagraph"/>
+              <w:ind w:left="459"/>
+              <w:jc w:val="both"/>
+            </w:pPr>
+          </w:p>
+          <w:p>
+            <w:pPr>
+              <w:pStyle w:val="ListParagraph"/>
+              <w:ind w:left="459"/>
+              <w:jc w:val="both"/>
+            </w:pPr>
+            <w:r>
+              <w:t>public class Student {</w:t>
+            </w:r>
+          </w:p>
+          <w:p>
+            <w:pPr>
+              <w:pStyle w:val="ListParagraph"/>
+              <w:ind w:left="459"/>
+              <w:jc w:val="both"/>
+            </w:pPr>
+            <w:r>
+              <w:t xml:space="preserve">    private int </w:t>
+            </w:r>
+            <w:proofErr w:type="gramStart"/>
+            <w:r>
+              <w:t>id;</w:t>
+            </w:r>
+            <w:proofErr w:type="gramEnd"/>
+          </w:p>
+          <w:p>
+            <w:pPr>
+              <w:pStyle w:val="ListParagraph"/>
+              <w:ind w:left="459"/>
+              <w:jc w:val="both"/>
+            </w:pPr>
+            <w:r>
+              <w:t xml:space="preserve">    private String </w:t>
+            </w:r>
+            <w:proofErr w:type="gramStart"/>
+            <w:r>
+              <w:t>name;</w:t>
+            </w:r>
+            <w:proofErr w:type="gramEnd"/>
+          </w:p>
+          <w:p>
+            <w:pPr>
+              <w:pStyle w:val="ListParagraph"/>
+              <w:ind w:left="459"/>
+              <w:jc w:val="both"/>
+            </w:pPr>
+          </w:p>
+          <w:p>
+            <w:pPr>
+              <w:pStyle w:val="ListParagraph"/>
+              <w:ind w:left="459"/>
+              <w:jc w:val="both"/>
+            </w:pPr>
+            <w:r>
+              <w:t xml:space="preserve">    //constructor</w:t>
+            </w:r>
+          </w:p>
+          <w:p>
+            <w:pPr>
+              <w:pStyle w:val="ListParagraph"/>
+              <w:ind w:left="459"/>
+              <w:jc w:val="both"/>
+            </w:pPr>
+            <w:r>
+              <w:t xml:space="preserve">    public </w:t>
+            </w:r>
+            <w:proofErr w:type="gramStart"/>
+            <w:r>
+              <w:t>Student(</w:t>
+            </w:r>
+            <w:proofErr w:type="gramEnd"/>
+            <w:r>
+              <w:t>int id, String name) {</w:t>
+            </w:r>
+          </w:p>
+          <w:p>
+            <w:pPr>
+              <w:pStyle w:val="ListParagraph"/>
+              <w:ind w:left="459"/>
+              <w:jc w:val="both"/>
+            </w:pPr>
+            <w:r>
+              <w:t xml:space="preserve">        this.id = </w:t>
+            </w:r>
+            <w:proofErr w:type="gramStart"/>
+            <w:r>
+              <w:t>id;</w:t>
+            </w:r>
+            <w:proofErr w:type="gramEnd"/>
+          </w:p>
+          <w:p>
+            <w:pPr>
+              <w:pStyle w:val="ListParagraph"/>
+              <w:ind w:left="459"/>
+              <w:jc w:val="both"/>
+            </w:pPr>
+            <w:r>
+              <w:t xml:space="preserve">        this.name = </w:t>
+            </w:r>
+            <w:proofErr w:type="gramStart"/>
+            <w:r>
+              <w:t>name;</w:t>
+            </w:r>
+            <w:proofErr w:type="gramEnd"/>
+          </w:p>
+          <w:p>
+            <w:pPr>
+              <w:pStyle w:val="ListParagraph"/>
+              <w:ind w:left="459"/>
+              <w:jc w:val="both"/>
+            </w:pPr>
+            <w:r>
+              <w:t xml:space="preserve">    }</w:t>
+            </w:r>
+          </w:p>
+          <w:p>
+            <w:pPr>
+              <w:pStyle w:val="ListParagraph"/>
+              <w:ind w:left="459"/>
+              <w:jc w:val="both"/>
+            </w:pPr>
+          </w:p>
+          <w:p>
+            <w:pPr>
+              <w:pStyle w:val="ListParagraph"/>
+              <w:ind w:left="459"/>
+              <w:jc w:val="both"/>
+            </w:pPr>
+            <w:r>
+              <w:t xml:space="preserve">    //getter</w:t>
+            </w:r>
+          </w:p>
+          <w:p>
+            <w:pPr>
+              <w:pStyle w:val="ListParagraph"/>
+              <w:ind w:left="459"/>
+              <w:jc w:val="both"/>
+            </w:pPr>
+            <w:r>
+              <w:t xml:space="preserve">    public int </w:t>
+            </w:r>
+            <w:proofErr w:type="spellStart"/>
+            <w:proofErr w:type="gramStart"/>
+            <w:r>
+              <w:t>getId</w:t>
+            </w:r>
+            <w:proofErr w:type="spellEnd"/>
+            <w:r>
+              <w:t>(</w:t>
+            </w:r>
+            <w:proofErr w:type="gramEnd"/>
+            <w:r>
+              <w:t>) {</w:t>
+            </w:r>
+          </w:p>
+          <w:p>
+            <w:pPr>
+              <w:pStyle w:val="ListParagraph"/>
+              <w:ind w:left="459"/>
+              <w:jc w:val="both"/>
+            </w:pPr>
+            <w:r>
+              <w:t xml:space="preserve">        return </w:t>
+            </w:r>
+            <w:proofErr w:type="gramStart"/>
+            <w:r>
+              <w:t>id;</w:t>
+            </w:r>
+            <w:proofErr w:type="gramEnd"/>
+          </w:p>
+          <w:p>
+            <w:pPr>
+              <w:pStyle w:val="ListParagraph"/>
+              <w:ind w:left="459"/>
+              <w:jc w:val="both"/>
+            </w:pPr>
+            <w:r>
+              <w:t xml:space="preserve">    }</w:t>
+            </w:r>
+          </w:p>
+          <w:p>
+            <w:pPr>
+              <w:pStyle w:val="ListParagraph"/>
+              <w:ind w:left="459"/>
+              <w:jc w:val="both"/>
+            </w:pPr>
+          </w:p>
+          <w:p>
+            <w:pPr>
+              <w:pStyle w:val="ListParagraph"/>
+              <w:ind w:left="459"/>
+              <w:jc w:val="both"/>
+            </w:pPr>
+            <w:r>
+              <w:t xml:space="preserve">    public String </w:t>
+            </w:r>
+            <w:proofErr w:type="spellStart"/>
+            <w:proofErr w:type="gramStart"/>
+            <w:r>
+              <w:t>getName</w:t>
+            </w:r>
+            <w:proofErr w:type="spellEnd"/>
+            <w:r>
+              <w:t>(</w:t>
+            </w:r>
+            <w:proofErr w:type="gramEnd"/>
+            <w:r>
+              <w:t>) {</w:t>
+            </w:r>
+          </w:p>
+          <w:p>
+            <w:pPr>
+              <w:pStyle w:val="ListParagraph"/>
+              <w:ind w:left="459"/>
+              <w:jc w:val="both"/>
+            </w:pPr>
+            <w:r>
+              <w:t xml:space="preserve">        return </w:t>
+            </w:r>
+            <w:proofErr w:type="gramStart"/>
+            <w:r>
+              <w:t>name;</w:t>
+            </w:r>
+            <w:proofErr w:type="gramEnd"/>
+          </w:p>
+          <w:p>
+            <w:pPr>
+              <w:pStyle w:val="ListParagraph"/>
+              <w:ind w:left="459"/>
+              <w:jc w:val="both"/>
+            </w:pPr>
+            <w:r>
+              <w:t xml:space="preserve">    }</w:t>
+            </w:r>
+          </w:p>
+          <w:p>
+            <w:pPr>
+              <w:pStyle w:val="ListParagraph"/>
+              <w:ind w:left="459"/>
+              <w:jc w:val="both"/>
+            </w:pPr>
+          </w:p>
+          <w:p>
+            <w:pPr>
+              <w:pStyle w:val="ListParagraph"/>
+              <w:ind w:left="459"/>
+              <w:jc w:val="both"/>
+            </w:pPr>
+            <w:r>
+              <w:t xml:space="preserve">    //output</w:t>
+            </w:r>
+          </w:p>
+          <w:p>
+            <w:pPr>
+              <w:pStyle w:val="ListParagraph"/>
+              <w:ind w:left="459"/>
+              <w:jc w:val="both"/>
+            </w:pPr>
+            <w:r>
+              <w:t xml:space="preserve">    public String </w:t>
+            </w:r>
+            <w:proofErr w:type="spellStart"/>
+            <w:proofErr w:type="gramStart"/>
+            <w:r>
+              <w:t>toString</w:t>
+            </w:r>
+            <w:proofErr w:type="spellEnd"/>
+            <w:r>
+              <w:t>(</w:t>
+            </w:r>
+            <w:proofErr w:type="gramEnd"/>
+            <w:r>
+              <w:t>) {</w:t>
+            </w:r>
+          </w:p>
+          <w:p>
+            <w:pPr>
+              <w:pStyle w:val="ListParagraph"/>
+              <w:ind w:left="459"/>
+              <w:jc w:val="both"/>
+            </w:pPr>
+            <w:r>
+              <w:t xml:space="preserve">        return "</w:t>
+            </w:r>
+            <w:proofErr w:type="gramStart"/>
+            <w:r>
+              <w:t>Student{</w:t>
+            </w:r>
+            <w:proofErr w:type="gramEnd"/>
+            <w:r>
+              <w:t>id: " + id + ", name: " + name + "}</w:t>
+            </w:r>
+            <w:proofErr w:type="gramStart"/>
+            <w:r>
+              <w:t>";</w:t>
+            </w:r>
+            <w:proofErr w:type="gramEnd"/>
+          </w:p>
+          <w:p>
+            <w:pPr>
+              <w:pStyle w:val="ListParagraph"/>
+              <w:ind w:left="459"/>
+              <w:jc w:val="both"/>
+            </w:pPr>
+            <w:r>
+              <w:t xml:space="preserve">    }</w:t>
+            </w:r>
+          </w:p>
+          <w:p>
+            <w:pPr>
+              <w:pStyle w:val="ListParagraph"/>
+              <w:ind w:left="459"/>
+              <w:jc w:val="both"/>
+            </w:pPr>
+            <w:r>
+              <w:t>}</w:t>
+            </w:r>
           </w:p>
         </w:tc>
       </w:tr>
@@ -3969,6 +6148,7 @@
                 <w:b/>
                 <w:bCs/>
               </w:rPr>
+              <w:lastRenderedPageBreak/>
               <w:t>Screenshot Hasil</w:t>
             </w:r>
           </w:p>
@@ -3986,6 +6166,48 @@
                 <w:bCs/>
               </w:rPr>
             </w:pPr>
+            <w:r>
+              <w:rPr>
+                <w:b/>
+                <w:bCs/>
+              </w:rPr>
+              <w:lastRenderedPageBreak/>
+              <w:drawing>
+                <wp:inline distT="0" distB="0" distL="0" distR="0" wp14:anchorId="1AC63451" wp14:editId="40D1D580">
+                  <wp:extent cx="5588000" cy="3141980"/>
+                  <wp:effectExtent l="0" t="0" r="0" b="1270"/>
+                  <wp:docPr id="1168867339" name="Picture 1"/>
+                  <wp:cNvGraphicFramePr>
+                    <a:graphicFrameLocks xmlns:a="http://schemas.openxmlformats.org/drawingml/2006/main" noChangeAspect="1"/>
+                  </wp:cNvGraphicFramePr>
+                  <a:graphic xmlns:a="http://schemas.openxmlformats.org/drawingml/2006/main">
+                    <a:graphicData uri="http://schemas.openxmlformats.org/drawingml/2006/picture">
+                      <pic:pic xmlns:pic="http://schemas.openxmlformats.org/drawingml/2006/picture">
+                        <pic:nvPicPr>
+                          <pic:cNvPr id="1168867339" name=""/>
+                          <pic:cNvPicPr/>
+                        </pic:nvPicPr>
+                        <pic:blipFill>
+                          <a:blip r:embed="rId8"/>
+                          <a:stretch>
+                            <a:fillRect/>
+                          </a:stretch>
+                        </pic:blipFill>
+                        <pic:spPr>
+                          <a:xfrm>
+                            <a:off x="0" y="0"/>
+                            <a:ext cx="5588000" cy="3141980"/>
+                          </a:xfrm>
+                          <a:prstGeom prst="rect">
+                            <a:avLst/>
+                          </a:prstGeom>
+                        </pic:spPr>
+                      </pic:pic>
+                    </a:graphicData>
+                  </a:graphic>
+                </wp:inline>
+              </w:drawing>
+            </w:r>
           </w:p>
         </w:tc>
       </w:tr>
@@ -5149,8 +7371,496 @@
           </w:tcPr>
           <w:p>
             <w:pPr>
-              <w:jc w:val="both"/>
-            </w:pPr>
+              <w:pStyle w:val="ListParagraph"/>
+              <w:numPr>
+                <w:ilvl w:val="0"/>
+                <w:numId w:val="7"/>
+              </w:numPr>
+              <w:ind w:left="459"/>
+              <w:jc w:val="both"/>
+              <w:rPr>
+                <w:b/>
+                <w:bCs/>
+              </w:rPr>
+            </w:pPr>
+            <w:r>
+              <w:rPr>
+                <w:b/>
+                <w:bCs/>
+              </w:rPr>
+              <w:t>ProblemThree.java</w:t>
+            </w:r>
+          </w:p>
+          <w:p>
+            <w:pPr>
+              <w:pStyle w:val="ListParagraph"/>
+              <w:ind w:left="459"/>
+              <w:jc w:val="both"/>
+            </w:pPr>
+            <w:r>
+              <w:lastRenderedPageBreak/>
+              <w:t xml:space="preserve">package </w:t>
+            </w:r>
+            <w:proofErr w:type="spellStart"/>
+            <w:proofErr w:type="gramStart"/>
+            <w:r>
+              <w:t>JavaProblems</w:t>
+            </w:r>
+            <w:proofErr w:type="spellEnd"/>
+            <w:r>
+              <w:t>;</w:t>
+            </w:r>
+            <w:proofErr w:type="gramEnd"/>
+          </w:p>
+          <w:p>
+            <w:pPr>
+              <w:pStyle w:val="ListParagraph"/>
+              <w:ind w:left="459"/>
+              <w:jc w:val="both"/>
+            </w:pPr>
+          </w:p>
+          <w:p>
+            <w:pPr>
+              <w:pStyle w:val="ListParagraph"/>
+              <w:ind w:left="459"/>
+              <w:jc w:val="both"/>
+            </w:pPr>
+            <w:r>
+              <w:t xml:space="preserve">import </w:t>
+            </w:r>
+            <w:proofErr w:type="spellStart"/>
+            <w:proofErr w:type="gramStart"/>
+            <w:r>
+              <w:t>java.util</w:t>
+            </w:r>
+            <w:proofErr w:type="gramEnd"/>
+            <w:r>
+              <w:t>.</w:t>
+            </w:r>
+            <w:proofErr w:type="gramStart"/>
+            <w:r>
+              <w:t>Arrays</w:t>
+            </w:r>
+            <w:proofErr w:type="spellEnd"/>
+            <w:r>
+              <w:t>;</w:t>
+            </w:r>
+            <w:proofErr w:type="gramEnd"/>
+          </w:p>
+          <w:p>
+            <w:pPr>
+              <w:pStyle w:val="ListParagraph"/>
+              <w:ind w:left="459"/>
+              <w:jc w:val="both"/>
+            </w:pPr>
+          </w:p>
+          <w:p>
+            <w:pPr>
+              <w:pStyle w:val="ListParagraph"/>
+              <w:ind w:left="459"/>
+              <w:jc w:val="both"/>
+            </w:pPr>
+            <w:r>
+              <w:t xml:space="preserve">public class </w:t>
+            </w:r>
+            <w:proofErr w:type="spellStart"/>
+            <w:r>
+              <w:t>ProblemThree</w:t>
+            </w:r>
+            <w:proofErr w:type="spellEnd"/>
+            <w:r>
+              <w:t xml:space="preserve"> {</w:t>
+            </w:r>
+          </w:p>
+          <w:p>
+            <w:pPr>
+              <w:pStyle w:val="ListParagraph"/>
+              <w:ind w:left="459"/>
+              <w:jc w:val="both"/>
+            </w:pPr>
+            <w:r>
+              <w:t xml:space="preserve">    public static void </w:t>
+            </w:r>
+            <w:proofErr w:type="gramStart"/>
+            <w:r>
+              <w:t>main(String[</w:t>
+            </w:r>
+            <w:proofErr w:type="gramEnd"/>
+            <w:r>
+              <w:t xml:space="preserve">] </w:t>
+            </w:r>
+            <w:proofErr w:type="spellStart"/>
+            <w:r>
+              <w:t>args</w:t>
+            </w:r>
+            <w:proofErr w:type="spellEnd"/>
+            <w:r>
+              <w:t>) {</w:t>
+            </w:r>
+          </w:p>
+          <w:p>
+            <w:pPr>
+              <w:pStyle w:val="ListParagraph"/>
+              <w:ind w:left="459"/>
+              <w:jc w:val="both"/>
+            </w:pPr>
+            <w:r>
+              <w:t xml:space="preserve">        int </w:t>
+            </w:r>
+            <w:proofErr w:type="spellStart"/>
+            <w:proofErr w:type="gramStart"/>
+            <w:r>
+              <w:t>arr</w:t>
+            </w:r>
+            <w:proofErr w:type="spellEnd"/>
+            <w:r>
+              <w:t>[</w:t>
+            </w:r>
+            <w:proofErr w:type="gramEnd"/>
+            <w:r>
+              <w:t>] = {12, 4, 3, 1, 9, 657</w:t>
+            </w:r>
+            <w:proofErr w:type="gramStart"/>
+            <w:r>
+              <w:t>};</w:t>
+            </w:r>
+            <w:proofErr w:type="gramEnd"/>
+          </w:p>
+          <w:p>
+            <w:pPr>
+              <w:pStyle w:val="ListParagraph"/>
+              <w:ind w:left="459"/>
+              <w:jc w:val="both"/>
+            </w:pPr>
+            <w:r>
+              <w:t xml:space="preserve">        int n = 3; // </w:t>
+            </w:r>
+            <w:proofErr w:type="spellStart"/>
+            <w:r>
+              <w:t>Mencari</w:t>
+            </w:r>
+            <w:proofErr w:type="spellEnd"/>
+            <w:r>
+              <w:t xml:space="preserve"> </w:t>
+            </w:r>
+            <w:proofErr w:type="spellStart"/>
+            <w:r>
+              <w:t>elemen</w:t>
+            </w:r>
+            <w:proofErr w:type="spellEnd"/>
+            <w:r>
+              <w:t xml:space="preserve"> </w:t>
+            </w:r>
+            <w:proofErr w:type="spellStart"/>
+            <w:r>
+              <w:t>terbesar</w:t>
+            </w:r>
+            <w:proofErr w:type="spellEnd"/>
+            <w:r>
+              <w:t xml:space="preserve"> ke-3</w:t>
+            </w:r>
+          </w:p>
+          <w:p>
+            <w:pPr>
+              <w:pStyle w:val="ListParagraph"/>
+              <w:ind w:left="459"/>
+              <w:jc w:val="both"/>
+            </w:pPr>
+          </w:p>
+          <w:p>
+            <w:pPr>
+              <w:pStyle w:val="ListParagraph"/>
+              <w:ind w:left="459"/>
+              <w:jc w:val="both"/>
+            </w:pPr>
+            <w:r>
+              <w:t xml:space="preserve">        int </w:t>
+            </w:r>
+            <w:proofErr w:type="spellStart"/>
+            <w:r>
+              <w:t>ans</w:t>
+            </w:r>
+            <w:proofErr w:type="spellEnd"/>
+            <w:r>
+              <w:t xml:space="preserve"> = </w:t>
+            </w:r>
+            <w:proofErr w:type="spellStart"/>
+            <w:r>
+              <w:t>Arrays.stream</w:t>
+            </w:r>
+            <w:proofErr w:type="spellEnd"/>
+            <w:r>
+              <w:t>(</w:t>
+            </w:r>
+            <w:proofErr w:type="spellStart"/>
+            <w:r>
+              <w:t>arr</w:t>
+            </w:r>
+            <w:proofErr w:type="spellEnd"/>
+            <w:r>
+              <w:t>)</w:t>
+            </w:r>
+          </w:p>
+          <w:p>
+            <w:pPr>
+              <w:pStyle w:val="ListParagraph"/>
+              <w:ind w:left="459"/>
+              <w:jc w:val="both"/>
+            </w:pPr>
+            <w:r>
+              <w:t xml:space="preserve">                </w:t>
+            </w:r>
+            <w:proofErr w:type="gramStart"/>
+            <w:r>
+              <w:t xml:space="preserve">.boxed()   </w:t>
+            </w:r>
+            <w:proofErr w:type="gramEnd"/>
+            <w:r>
+              <w:t xml:space="preserve">                          // </w:t>
+            </w:r>
+            <w:proofErr w:type="spellStart"/>
+            <w:r>
+              <w:t>Konversi</w:t>
+            </w:r>
+            <w:proofErr w:type="spellEnd"/>
+            <w:r>
+              <w:t xml:space="preserve"> </w:t>
+            </w:r>
+            <w:proofErr w:type="spellStart"/>
+            <w:r>
+              <w:t>ke</w:t>
+            </w:r>
+            <w:proofErr w:type="spellEnd"/>
+            <w:r>
+              <w:t xml:space="preserve"> Stream&lt;Integer&gt;</w:t>
+            </w:r>
+          </w:p>
+          <w:p>
+            <w:pPr>
+              <w:pStyle w:val="ListParagraph"/>
+              <w:ind w:left="459"/>
+              <w:jc w:val="both"/>
+            </w:pPr>
+            <w:r>
+              <w:t xml:space="preserve">                </w:t>
+            </w:r>
+            <w:proofErr w:type="gramStart"/>
+            <w:r>
+              <w:t>.sorted</w:t>
+            </w:r>
+            <w:proofErr w:type="gramEnd"/>
+            <w:r>
+              <w:t xml:space="preserve">((a, b) -&gt; </w:t>
+            </w:r>
+            <w:proofErr w:type="spellStart"/>
+            <w:r>
+              <w:t>Integer.compare</w:t>
+            </w:r>
+            <w:proofErr w:type="spellEnd"/>
+            <w:r>
+              <w:t>(b, a</w:t>
+            </w:r>
+            <w:proofErr w:type="gramStart"/>
+            <w:r>
+              <w:t xml:space="preserve">))   </w:t>
+            </w:r>
+            <w:proofErr w:type="gramEnd"/>
+            <w:r>
+              <w:t xml:space="preserve">  // </w:t>
+            </w:r>
+            <w:proofErr w:type="spellStart"/>
+            <w:r>
+              <w:t>Urutkan</w:t>
+            </w:r>
+            <w:proofErr w:type="spellEnd"/>
+            <w:r>
+              <w:t xml:space="preserve"> descending</w:t>
+            </w:r>
+          </w:p>
+          <w:p>
+            <w:pPr>
+              <w:pStyle w:val="ListParagraph"/>
+              <w:ind w:left="459"/>
+              <w:jc w:val="both"/>
+            </w:pPr>
+            <w:r>
+              <w:t xml:space="preserve">                </w:t>
+            </w:r>
+            <w:proofErr w:type="gramStart"/>
+            <w:r>
+              <w:t>.skip</w:t>
+            </w:r>
+            <w:proofErr w:type="gramEnd"/>
+            <w:r>
+              <w:t xml:space="preserve">(n - 1)                        // </w:t>
+            </w:r>
+            <w:proofErr w:type="spellStart"/>
+            <w:r>
+              <w:t>Lewati</w:t>
+            </w:r>
+            <w:proofErr w:type="spellEnd"/>
+            <w:r>
+              <w:t xml:space="preserve"> 2 </w:t>
+            </w:r>
+            <w:proofErr w:type="spellStart"/>
+            <w:r>
+              <w:t>elemen</w:t>
+            </w:r>
+            <w:proofErr w:type="spellEnd"/>
+            <w:r>
+              <w:t xml:space="preserve"> </w:t>
+            </w:r>
+            <w:proofErr w:type="spellStart"/>
+            <w:r>
+              <w:t>pertama</w:t>
+            </w:r>
+            <w:proofErr w:type="spellEnd"/>
+          </w:p>
+          <w:p>
+            <w:pPr>
+              <w:pStyle w:val="ListParagraph"/>
+              <w:ind w:left="459"/>
+              <w:jc w:val="both"/>
+            </w:pPr>
+            <w:r>
+              <w:t xml:space="preserve">                </w:t>
+            </w:r>
+            <w:proofErr w:type="gramStart"/>
+            <w:r>
+              <w:t>.</w:t>
+            </w:r>
+            <w:proofErr w:type="spellStart"/>
+            <w:r>
+              <w:t>findFirst</w:t>
+            </w:r>
+            <w:proofErr w:type="spellEnd"/>
+            <w:r>
+              <w:t xml:space="preserve">()   </w:t>
+            </w:r>
+            <w:proofErr w:type="gramEnd"/>
+            <w:r>
+              <w:t xml:space="preserve">                          // Ambil </w:t>
+            </w:r>
+            <w:proofErr w:type="spellStart"/>
+            <w:r>
+              <w:t>elemen</w:t>
+            </w:r>
+            <w:proofErr w:type="spellEnd"/>
+            <w:r>
+              <w:t xml:space="preserve"> yang </w:t>
+            </w:r>
+            <w:proofErr w:type="spellStart"/>
+            <w:r>
+              <w:t>tersisa</w:t>
+            </w:r>
+            <w:proofErr w:type="spellEnd"/>
+          </w:p>
+          <w:p>
+            <w:pPr>
+              <w:pStyle w:val="ListParagraph"/>
+              <w:ind w:left="459"/>
+              <w:jc w:val="both"/>
+            </w:pPr>
+            <w:r>
+              <w:t xml:space="preserve">                </w:t>
+            </w:r>
+            <w:proofErr w:type="gramStart"/>
+            <w:r>
+              <w:t>.</w:t>
+            </w:r>
+            <w:proofErr w:type="spellStart"/>
+            <w:r>
+              <w:t>orElse</w:t>
+            </w:r>
+            <w:proofErr w:type="spellEnd"/>
+            <w:proofErr w:type="gramEnd"/>
+            <w:r>
+              <w:t>(0</w:t>
+            </w:r>
+            <w:proofErr w:type="gramStart"/>
+            <w:r>
+              <w:t xml:space="preserve">);   </w:t>
+            </w:r>
+            <w:proofErr w:type="gramEnd"/>
+            <w:r>
+              <w:t xml:space="preserve">                        // Nilai default </w:t>
+            </w:r>
+            <w:proofErr w:type="spellStart"/>
+            <w:r>
+              <w:t>jika</w:t>
+            </w:r>
+            <w:proofErr w:type="spellEnd"/>
+            <w:r>
+              <w:t xml:space="preserve"> </w:t>
+            </w:r>
+            <w:proofErr w:type="spellStart"/>
+            <w:r>
+              <w:t>tidak</w:t>
+            </w:r>
+            <w:proofErr w:type="spellEnd"/>
+            <w:r>
+              <w:t xml:space="preserve"> </w:t>
+            </w:r>
+            <w:proofErr w:type="spellStart"/>
+            <w:r>
+              <w:t>ada</w:t>
+            </w:r>
+            <w:proofErr w:type="spellEnd"/>
+          </w:p>
+          <w:p>
+            <w:pPr>
+              <w:pStyle w:val="ListParagraph"/>
+              <w:ind w:left="459"/>
+              <w:jc w:val="both"/>
+            </w:pPr>
+          </w:p>
+          <w:p>
+            <w:pPr>
+              <w:pStyle w:val="ListParagraph"/>
+              <w:ind w:left="459"/>
+              <w:jc w:val="both"/>
+            </w:pPr>
+            <w:r>
+              <w:t xml:space="preserve">        </w:t>
+            </w:r>
+            <w:proofErr w:type="spellStart"/>
+            <w:r>
+              <w:t>System.out.println</w:t>
+            </w:r>
+            <w:proofErr w:type="spellEnd"/>
+            <w:r>
+              <w:t xml:space="preserve">("The 3rd largest element is: " + </w:t>
+            </w:r>
+            <w:proofErr w:type="spellStart"/>
+            <w:r>
+              <w:t>ans</w:t>
+            </w:r>
+            <w:proofErr w:type="spellEnd"/>
+            <w:proofErr w:type="gramStart"/>
+            <w:r>
+              <w:t>);</w:t>
+            </w:r>
+            <w:proofErr w:type="gramEnd"/>
+          </w:p>
+          <w:p>
+            <w:pPr>
+              <w:pStyle w:val="ListParagraph"/>
+              <w:ind w:left="459"/>
+              <w:jc w:val="both"/>
+            </w:pPr>
+            <w:r>
+              <w:t xml:space="preserve">    }</w:t>
+            </w:r>
+          </w:p>
+          <w:p>
+            <w:pPr>
+              <w:pStyle w:val="ListParagraph"/>
+              <w:ind w:left="459"/>
+              <w:jc w:val="both"/>
+            </w:pPr>
+            <w:r>
+              <w:t>}</w:t>
+            </w:r>
           </w:p>
         </w:tc>
       </w:tr>
@@ -5190,6 +7900,47 @@
                 <w:bCs/>
               </w:rPr>
             </w:pPr>
+            <w:r>
+              <w:rPr>
+                <w:b/>
+                <w:bCs/>
+              </w:rPr>
+              <w:drawing>
+                <wp:inline distT="0" distB="0" distL="0" distR="0" wp14:anchorId="7BCFB61E" wp14:editId="6A8A93CF">
+                  <wp:extent cx="5588000" cy="3141980"/>
+                  <wp:effectExtent l="0" t="0" r="0" b="1270"/>
+                  <wp:docPr id="722172530" name="Picture 1"/>
+                  <wp:cNvGraphicFramePr>
+                    <a:graphicFrameLocks xmlns:a="http://schemas.openxmlformats.org/drawingml/2006/main" noChangeAspect="1"/>
+                  </wp:cNvGraphicFramePr>
+                  <a:graphic xmlns:a="http://schemas.openxmlformats.org/drawingml/2006/main">
+                    <a:graphicData uri="http://schemas.openxmlformats.org/drawingml/2006/picture">
+                      <pic:pic xmlns:pic="http://schemas.openxmlformats.org/drawingml/2006/picture">
+                        <pic:nvPicPr>
+                          <pic:cNvPr id="722172530" name=""/>
+                          <pic:cNvPicPr/>
+                        </pic:nvPicPr>
+                        <pic:blipFill>
+                          <a:blip r:embed="rId9"/>
+                          <a:stretch>
+                            <a:fillRect/>
+                          </a:stretch>
+                        </pic:blipFill>
+                        <pic:spPr>
+                          <a:xfrm>
+                            <a:off x="0" y="0"/>
+                            <a:ext cx="5588000" cy="3141980"/>
+                          </a:xfrm>
+                          <a:prstGeom prst="rect">
+                            <a:avLst/>
+                          </a:prstGeom>
+                        </pic:spPr>
+                      </pic:pic>
+                    </a:graphicData>
+                  </a:graphic>
+                </wp:inline>
+              </w:drawing>
+            </w:r>
           </w:p>
         </w:tc>
       </w:tr>
@@ -5563,6 +8314,95 @@
     </w:lvl>
   </w:abstractNum>
   <w:abstractNum w:abstractNumId="3" w15:restartNumberingAfterBreak="0">
+    <w:nsid w:val="543950FC"/>
+    <w:multiLevelType w:val="hybridMultilevel"/>
+    <w:tmpl w:val="25D01C20"/>
+    <w:lvl w:ilvl="0" w:tplc="3809000F">
+      <w:start w:val="1"/>
+      <w:numFmt w:val="decimal"/>
+      <w:lvlText w:val="%1."/>
+      <w:lvlJc w:val="left"/>
+      <w:pPr>
+        <w:ind w:left="720" w:hanging="360"/>
+      </w:pPr>
+      <w:rPr>
+        <w:rFonts w:hint="default"/>
+      </w:rPr>
+    </w:lvl>
+    <w:lvl w:ilvl="1" w:tplc="38090019" w:tentative="1">
+      <w:start w:val="1"/>
+      <w:numFmt w:val="lowerLetter"/>
+      <w:lvlText w:val="%2."/>
+      <w:lvlJc w:val="left"/>
+      <w:pPr>
+        <w:ind w:left="1440" w:hanging="360"/>
+      </w:pPr>
+    </w:lvl>
+    <w:lvl w:ilvl="2" w:tplc="3809001B" w:tentative="1">
+      <w:start w:val="1"/>
+      <w:numFmt w:val="lowerRoman"/>
+      <w:lvlText w:val="%3."/>
+      <w:lvlJc w:val="right"/>
+      <w:pPr>
+        <w:ind w:left="2160" w:hanging="180"/>
+      </w:pPr>
+    </w:lvl>
+    <w:lvl w:ilvl="3" w:tplc="3809000F" w:tentative="1">
+      <w:start w:val="1"/>
+      <w:numFmt w:val="decimal"/>
+      <w:lvlText w:val="%4."/>
+      <w:lvlJc w:val="left"/>
+      <w:pPr>
+        <w:ind w:left="2880" w:hanging="360"/>
+      </w:pPr>
+    </w:lvl>
+    <w:lvl w:ilvl="4" w:tplc="38090019" w:tentative="1">
+      <w:start w:val="1"/>
+      <w:numFmt w:val="lowerLetter"/>
+      <w:lvlText w:val="%5."/>
+      <w:lvlJc w:val="left"/>
+      <w:pPr>
+        <w:ind w:left="3600" w:hanging="360"/>
+      </w:pPr>
+    </w:lvl>
+    <w:lvl w:ilvl="5" w:tplc="3809001B" w:tentative="1">
+      <w:start w:val="1"/>
+      <w:numFmt w:val="lowerRoman"/>
+      <w:lvlText w:val="%6."/>
+      <w:lvlJc w:val="right"/>
+      <w:pPr>
+        <w:ind w:left="4320" w:hanging="180"/>
+      </w:pPr>
+    </w:lvl>
+    <w:lvl w:ilvl="6" w:tplc="3809000F" w:tentative="1">
+      <w:start w:val="1"/>
+      <w:numFmt w:val="decimal"/>
+      <w:lvlText w:val="%7."/>
+      <w:lvlJc w:val="left"/>
+      <w:pPr>
+        <w:ind w:left="5040" w:hanging="360"/>
+      </w:pPr>
+    </w:lvl>
+    <w:lvl w:ilvl="7" w:tplc="38090019" w:tentative="1">
+      <w:start w:val="1"/>
+      <w:numFmt w:val="lowerLetter"/>
+      <w:lvlText w:val="%8."/>
+      <w:lvlJc w:val="left"/>
+      <w:pPr>
+        <w:ind w:left="5760" w:hanging="360"/>
+      </w:pPr>
+    </w:lvl>
+    <w:lvl w:ilvl="8" w:tplc="3809001B" w:tentative="1">
+      <w:start w:val="1"/>
+      <w:numFmt w:val="lowerRoman"/>
+      <w:lvlText w:val="%9."/>
+      <w:lvlJc w:val="right"/>
+      <w:pPr>
+        <w:ind w:left="6480" w:hanging="180"/>
+      </w:pPr>
+    </w:lvl>
+  </w:abstractNum>
+  <w:abstractNum w:abstractNumId="4" w15:restartNumberingAfterBreak="0">
     <w:nsid w:val="57895AD5"/>
     <w:multiLevelType w:val="hybridMultilevel"/>
     <w:tmpl w:val="D028117E"/>
@@ -5648,7 +8488,96 @@
       </w:pPr>
     </w:lvl>
   </w:abstractNum>
-  <w:abstractNum w:abstractNumId="4" w15:restartNumberingAfterBreak="0">
+  <w:abstractNum w:abstractNumId="5" w15:restartNumberingAfterBreak="0">
+    <w:nsid w:val="66D8288A"/>
+    <w:multiLevelType w:val="hybridMultilevel"/>
+    <w:tmpl w:val="123869D8"/>
+    <w:lvl w:ilvl="0" w:tplc="3809000F">
+      <w:start w:val="1"/>
+      <w:numFmt w:val="decimal"/>
+      <w:lvlText w:val="%1."/>
+      <w:lvlJc w:val="left"/>
+      <w:pPr>
+        <w:ind w:left="720" w:hanging="360"/>
+      </w:pPr>
+      <w:rPr>
+        <w:rFonts w:hint="default"/>
+      </w:rPr>
+    </w:lvl>
+    <w:lvl w:ilvl="1" w:tplc="38090019" w:tentative="1">
+      <w:start w:val="1"/>
+      <w:numFmt w:val="lowerLetter"/>
+      <w:lvlText w:val="%2."/>
+      <w:lvlJc w:val="left"/>
+      <w:pPr>
+        <w:ind w:left="1440" w:hanging="360"/>
+      </w:pPr>
+    </w:lvl>
+    <w:lvl w:ilvl="2" w:tplc="3809001B" w:tentative="1">
+      <w:start w:val="1"/>
+      <w:numFmt w:val="lowerRoman"/>
+      <w:lvlText w:val="%3."/>
+      <w:lvlJc w:val="right"/>
+      <w:pPr>
+        <w:ind w:left="2160" w:hanging="180"/>
+      </w:pPr>
+    </w:lvl>
+    <w:lvl w:ilvl="3" w:tplc="3809000F" w:tentative="1">
+      <w:start w:val="1"/>
+      <w:numFmt w:val="decimal"/>
+      <w:lvlText w:val="%4."/>
+      <w:lvlJc w:val="left"/>
+      <w:pPr>
+        <w:ind w:left="2880" w:hanging="360"/>
+      </w:pPr>
+    </w:lvl>
+    <w:lvl w:ilvl="4" w:tplc="38090019" w:tentative="1">
+      <w:start w:val="1"/>
+      <w:numFmt w:val="lowerLetter"/>
+      <w:lvlText w:val="%5."/>
+      <w:lvlJc w:val="left"/>
+      <w:pPr>
+        <w:ind w:left="3600" w:hanging="360"/>
+      </w:pPr>
+    </w:lvl>
+    <w:lvl w:ilvl="5" w:tplc="3809001B" w:tentative="1">
+      <w:start w:val="1"/>
+      <w:numFmt w:val="lowerRoman"/>
+      <w:lvlText w:val="%6."/>
+      <w:lvlJc w:val="right"/>
+      <w:pPr>
+        <w:ind w:left="4320" w:hanging="180"/>
+      </w:pPr>
+    </w:lvl>
+    <w:lvl w:ilvl="6" w:tplc="3809000F" w:tentative="1">
+      <w:start w:val="1"/>
+      <w:numFmt w:val="decimal"/>
+      <w:lvlText w:val="%7."/>
+      <w:lvlJc w:val="left"/>
+      <w:pPr>
+        <w:ind w:left="5040" w:hanging="360"/>
+      </w:pPr>
+    </w:lvl>
+    <w:lvl w:ilvl="7" w:tplc="38090019" w:tentative="1">
+      <w:start w:val="1"/>
+      <w:numFmt w:val="lowerLetter"/>
+      <w:lvlText w:val="%8."/>
+      <w:lvlJc w:val="left"/>
+      <w:pPr>
+        <w:ind w:left="5760" w:hanging="360"/>
+      </w:pPr>
+    </w:lvl>
+    <w:lvl w:ilvl="8" w:tplc="3809001B" w:tentative="1">
+      <w:start w:val="1"/>
+      <w:numFmt w:val="lowerRoman"/>
+      <w:lvlText w:val="%9."/>
+      <w:lvlJc w:val="right"/>
+      <w:pPr>
+        <w:ind w:left="6480" w:hanging="180"/>
+      </w:pPr>
+    </w:lvl>
+  </w:abstractNum>
+  <w:abstractNum w:abstractNumId="6" w15:restartNumberingAfterBreak="0">
     <w:nsid w:val="712746B5"/>
     <w:multiLevelType w:val="hybridMultilevel"/>
     <w:tmpl w:val="8F02C428"/>
@@ -5744,10 +8673,16 @@
     <w:abstractNumId w:val="1"/>
   </w:num>
   <w:num w:numId="4" w16cid:durableId="718358417">
+    <w:abstractNumId w:val="4"/>
+  </w:num>
+  <w:num w:numId="5" w16cid:durableId="1904293020">
+    <w:abstractNumId w:val="6"/>
+  </w:num>
+  <w:num w:numId="6" w16cid:durableId="2053142239">
     <w:abstractNumId w:val="3"/>
   </w:num>
-  <w:num w:numId="5" w16cid:durableId="1904293020">
-    <w:abstractNumId w:val="4"/>
+  <w:num w:numId="7" w16cid:durableId="1076171293">
+    <w:abstractNumId w:val="5"/>
   </w:num>
 </w:numbering>
 </file>

</xml_diff>